<commit_message>
Add project file - Report summary
</commit_message>
<xml_diff>
--- a/Fuel_Consumption_Report_Summary.docx
+++ b/Fuel_Consumption_Report_Summary.docx
@@ -6,10 +6,15 @@
       <w:pPr>
         <w:spacing w:before="480" w:after="120"/>
         <w:jc w:val="center"/>
+        <w:rPr>
+          <w:rFonts w:ascii="Times New Roman" w:hAnsi="Times New Roman" w:cs="Times New Roman"/>
+        </w:rPr>
       </w:pPr>
+      <w:bookmarkStart w:id="0" w:name="_GoBack"/>
+      <w:bookmarkEnd w:id="0"/>
       <w:r>
         <w:rPr>
-          <w:rFonts w:cs="Arial"/>
+          <w:rFonts w:ascii="Times New Roman" w:hAnsi="Times New Roman" w:cs="Times New Roman"/>
           <w:b/>
           <w:bCs/>
           <w:color w:val="1F4E79"/>
@@ -23,10 +28,13 @@
       <w:pPr>
         <w:spacing w:after="120"/>
         <w:jc w:val="center"/>
+        <w:rPr>
+          <w:rFonts w:ascii="Times New Roman" w:hAnsi="Times New Roman" w:cs="Times New Roman"/>
+        </w:rPr>
       </w:pPr>
       <w:r>
         <w:rPr>
-          <w:rFonts w:cs="Arial"/>
+          <w:rFonts w:ascii="Times New Roman" w:hAnsi="Times New Roman" w:cs="Times New Roman"/>
           <w:b/>
           <w:bCs/>
           <w:color w:val="2E75B6"/>
@@ -48,15 +56,16 @@
       <w:pPr>
         <w:spacing w:before="120" w:after="60"/>
         <w:jc w:val="center"/>
+        <w:rPr>
+          <w:rFonts w:ascii="Times New Roman" w:hAnsi="Times New Roman" w:cs="Times New Roman"/>
+        </w:rPr>
       </w:pPr>
       <w:r>
         <w:rPr>
-          <w:rFonts w:cs="Arial"/>
-          <w:i/>
-          <w:iCs/>
+          <w:rFonts w:ascii="Times New Roman" w:hAnsi="Times New Roman" w:cs="Times New Roman"/>
           <w:color w:val="595959"/>
-          <w:sz w:val="26"/>
-          <w:szCs w:val="26"/>
+          <w:sz w:val="28"/>
+          <w:szCs w:val="28"/>
         </w:rPr>
         <w:t>Project Summary Report</w:t>
       </w:r>
@@ -65,39 +74,165 @@
       <w:pPr>
         <w:spacing w:before="60" w:after="40"/>
         <w:jc w:val="center"/>
+        <w:rPr>
+          <w:sz w:val="24"/>
+          <w:szCs w:val="24"/>
+        </w:rPr>
       </w:pPr>
       <w:r>
         <w:rPr>
+          <w:rFonts w:ascii="Times New Roman" w:hAnsi="Times New Roman" w:cs="Times New Roman"/>
+          <w:color w:val="595959"/>
+          <w:sz w:val="24"/>
+          <w:szCs w:val="24"/>
+        </w:rPr>
+        <w:t>Prepared by:</w:t>
+      </w:r>
+      <w:r>
+        <w:rPr>
           <w:rFonts w:cs="Arial"/>
           <w:color w:val="595959"/>
-          <w:sz w:val="22"/>
-          <w:szCs w:val="22"/>
-        </w:rPr>
-        <w:t xml:space="preserve">Prepared by: </w:t>
+          <w:sz w:val="24"/>
+          <w:szCs w:val="24"/>
+        </w:rPr>
+        <w:t xml:space="preserve"> </w:t>
       </w:r>
+      <w:proofErr w:type="spellStart"/>
       <w:r>
         <w:rPr>
-          <w:rFonts w:cs="Arial"/>
+          <w:rFonts w:ascii="Times New Roman" w:hAnsi="Times New Roman" w:cs="Times New Roman"/>
           <w:b/>
           <w:bCs/>
           <w:color w:val="1F4E79"/>
-          <w:sz w:val="22"/>
-          <w:szCs w:val="22"/>
-        </w:rPr>
-        <w:t>Aditi Subhash Jadhav</w:t>
+          <w:sz w:val="24"/>
+          <w:szCs w:val="24"/>
+        </w:rPr>
+        <w:t>Aditi</w:t>
       </w:r>
+      <w:proofErr w:type="spellEnd"/>
+      <w:r>
+        <w:rPr>
+          <w:rFonts w:ascii="Times New Roman" w:hAnsi="Times New Roman" w:cs="Times New Roman"/>
+          <w:b/>
+          <w:bCs/>
+          <w:color w:val="1F4E79"/>
+          <w:sz w:val="24"/>
+          <w:szCs w:val="24"/>
+        </w:rPr>
+        <w:t xml:space="preserve"> </w:t>
+      </w:r>
+      <w:proofErr w:type="spellStart"/>
+      <w:r>
+        <w:rPr>
+          <w:rFonts w:ascii="Times New Roman" w:hAnsi="Times New Roman" w:cs="Times New Roman"/>
+          <w:b/>
+          <w:bCs/>
+          <w:color w:val="1F4E79"/>
+          <w:sz w:val="24"/>
+          <w:szCs w:val="24"/>
+        </w:rPr>
+        <w:t>Subhash</w:t>
+      </w:r>
+      <w:proofErr w:type="spellEnd"/>
+      <w:r>
+        <w:rPr>
+          <w:rFonts w:ascii="Times New Roman" w:hAnsi="Times New Roman" w:cs="Times New Roman"/>
+          <w:b/>
+          <w:bCs/>
+          <w:color w:val="1F4E79"/>
+          <w:sz w:val="24"/>
+          <w:szCs w:val="24"/>
+        </w:rPr>
+        <w:t xml:space="preserve"> </w:t>
+      </w:r>
+      <w:proofErr w:type="spellStart"/>
+      <w:r>
+        <w:rPr>
+          <w:rFonts w:ascii="Times New Roman" w:hAnsi="Times New Roman" w:cs="Times New Roman"/>
+          <w:b/>
+          <w:bCs/>
+          <w:color w:val="1F4E79"/>
+          <w:sz w:val="24"/>
+          <w:szCs w:val="24"/>
+        </w:rPr>
+        <w:t>Jadhav</w:t>
+      </w:r>
+      <w:proofErr w:type="spellEnd"/>
     </w:p>
     <w:p>
       <w:pPr>
         <w:spacing w:before="40" w:after="40"/>
         <w:jc w:val="center"/>
+        <w:rPr>
+          <w:rFonts w:ascii="Times New Roman" w:hAnsi="Times New Roman" w:cs="Times New Roman"/>
+          <w:sz w:val="24"/>
+          <w:szCs w:val="24"/>
+        </w:rPr>
       </w:pPr>
       <w:r>
         <w:rPr>
-          <w:rFonts w:cs="Arial"/>
+          <w:rFonts w:ascii="Times New Roman" w:hAnsi="Times New Roman" w:cs="Times New Roman"/>
           <w:color w:val="595959"/>
-        </w:rPr>
-        <w:t>Academic Year: 2025–2026  |  Sample Size: 567 Households  |  Variables: 30</w:t>
+          <w:sz w:val="24"/>
+          <w:szCs w:val="24"/>
+        </w:rPr>
+        <w:t>Project Duration</w:t>
+      </w:r>
+      <w:r>
+        <w:rPr>
+          <w:rFonts w:ascii="Times New Roman" w:hAnsi="Times New Roman" w:cs="Times New Roman"/>
+          <w:color w:val="595959"/>
+          <w:sz w:val="24"/>
+          <w:szCs w:val="24"/>
+        </w:rPr>
+        <w:t xml:space="preserve">: </w:t>
+      </w:r>
+      <w:r>
+        <w:rPr>
+          <w:rFonts w:ascii="Times New Roman" w:hAnsi="Times New Roman" w:cs="Times New Roman"/>
+          <w:color w:val="595959"/>
+          <w:sz w:val="24"/>
+          <w:szCs w:val="24"/>
+        </w:rPr>
+        <w:t xml:space="preserve">Dec </w:t>
+      </w:r>
+      <w:r>
+        <w:rPr>
+          <w:rFonts w:ascii="Times New Roman" w:hAnsi="Times New Roman" w:cs="Times New Roman"/>
+          <w:color w:val="595959"/>
+          <w:sz w:val="24"/>
+          <w:szCs w:val="24"/>
+        </w:rPr>
+        <w:t>2025–</w:t>
+      </w:r>
+      <w:r>
+        <w:rPr>
+          <w:rFonts w:ascii="Times New Roman" w:hAnsi="Times New Roman" w:cs="Times New Roman"/>
+          <w:color w:val="595959"/>
+          <w:sz w:val="24"/>
+          <w:szCs w:val="24"/>
+        </w:rPr>
+        <w:t xml:space="preserve"> Mar </w:t>
+      </w:r>
+      <w:proofErr w:type="gramStart"/>
+      <w:r>
+        <w:rPr>
+          <w:rFonts w:ascii="Times New Roman" w:hAnsi="Times New Roman" w:cs="Times New Roman"/>
+          <w:color w:val="595959"/>
+          <w:sz w:val="24"/>
+          <w:szCs w:val="24"/>
+        </w:rPr>
+        <w:t>2026  |</w:t>
+      </w:r>
+      <w:proofErr w:type="gramEnd"/>
+      <w:r>
+        <w:rPr>
+          <w:rFonts w:ascii="Times New Roman" w:hAnsi="Times New Roman" w:cs="Times New Roman"/>
+          <w:color w:val="595959"/>
+          <w:sz w:val="24"/>
+          <w:szCs w:val="24"/>
+        </w:rPr>
+        <w:t xml:space="preserve">  Sample Size: 567 Households  |  Variables: 30</w:t>
       </w:r>
     </w:p>
     <w:p>
@@ -150,10 +285,13 @@
           <w:p>
             <w:pPr>
               <w:jc w:val="center"/>
-            </w:pPr>
-            <w:r>
-              <w:rPr>
-                <w:rFonts w:cs="Arial"/>
+              <w:rPr>
+                <w:rFonts w:ascii="Times New Roman" w:hAnsi="Times New Roman" w:cs="Times New Roman"/>
+              </w:rPr>
+            </w:pPr>
+            <w:r>
+              <w:rPr>
+                <w:rFonts w:ascii="Times New Roman" w:hAnsi="Times New Roman" w:cs="Times New Roman"/>
                 <w:b/>
                 <w:bCs/>
                 <w:color w:val="FFFFFF"/>
@@ -167,10 +305,13 @@
             <w:pPr>
               <w:spacing w:before="40"/>
               <w:jc w:val="center"/>
-            </w:pPr>
-            <w:r>
-              <w:rPr>
-                <w:rFonts w:cs="Arial"/>
+              <w:rPr>
+                <w:rFonts w:ascii="Times New Roman" w:hAnsi="Times New Roman" w:cs="Times New Roman"/>
+              </w:rPr>
+            </w:pPr>
+            <w:r>
+              <w:rPr>
+                <w:rFonts w:ascii="Times New Roman" w:hAnsi="Times New Roman" w:cs="Times New Roman"/>
                 <w:color w:val="BDD7EE"/>
                 <w:sz w:val="18"/>
                 <w:szCs w:val="18"/>
@@ -199,10 +340,13 @@
           <w:p>
             <w:pPr>
               <w:jc w:val="center"/>
-            </w:pPr>
-            <w:r>
-              <w:rPr>
-                <w:rFonts w:cs="Arial"/>
+              <w:rPr>
+                <w:rFonts w:ascii="Times New Roman" w:hAnsi="Times New Roman" w:cs="Times New Roman"/>
+              </w:rPr>
+            </w:pPr>
+            <w:r>
+              <w:rPr>
+                <w:rFonts w:ascii="Times New Roman" w:hAnsi="Times New Roman" w:cs="Times New Roman"/>
                 <w:b/>
                 <w:bCs/>
                 <w:color w:val="FFFFFF"/>
@@ -216,10 +360,13 @@
             <w:pPr>
               <w:spacing w:before="40"/>
               <w:jc w:val="center"/>
-            </w:pPr>
-            <w:r>
-              <w:rPr>
-                <w:rFonts w:cs="Arial"/>
+              <w:rPr>
+                <w:rFonts w:ascii="Times New Roman" w:hAnsi="Times New Roman" w:cs="Times New Roman"/>
+              </w:rPr>
+            </w:pPr>
+            <w:r>
+              <w:rPr>
+                <w:rFonts w:ascii="Times New Roman" w:hAnsi="Times New Roman" w:cs="Times New Roman"/>
                 <w:color w:val="BDD7EE"/>
                 <w:sz w:val="18"/>
                 <w:szCs w:val="18"/>
@@ -248,10 +395,13 @@
           <w:p>
             <w:pPr>
               <w:jc w:val="center"/>
-            </w:pPr>
-            <w:r>
-              <w:rPr>
-                <w:rFonts w:cs="Arial"/>
+              <w:rPr>
+                <w:rFonts w:ascii="Times New Roman" w:hAnsi="Times New Roman" w:cs="Times New Roman"/>
+              </w:rPr>
+            </w:pPr>
+            <w:r>
+              <w:rPr>
+                <w:rFonts w:ascii="Times New Roman" w:hAnsi="Times New Roman" w:cs="Times New Roman"/>
                 <w:b/>
                 <w:bCs/>
                 <w:color w:val="FFFFFF"/>
@@ -265,10 +415,13 @@
             <w:pPr>
               <w:spacing w:before="40"/>
               <w:jc w:val="center"/>
-            </w:pPr>
-            <w:r>
-              <w:rPr>
-                <w:rFonts w:cs="Arial"/>
+              <w:rPr>
+                <w:rFonts w:ascii="Times New Roman" w:hAnsi="Times New Roman" w:cs="Times New Roman"/>
+              </w:rPr>
+            </w:pPr>
+            <w:r>
+              <w:rPr>
+                <w:rFonts w:ascii="Times New Roman" w:hAnsi="Times New Roman" w:cs="Times New Roman"/>
                 <w:color w:val="BDD7EE"/>
                 <w:sz w:val="18"/>
                 <w:szCs w:val="18"/>
@@ -297,10 +450,13 @@
           <w:p>
             <w:pPr>
               <w:jc w:val="center"/>
-            </w:pPr>
-            <w:r>
-              <w:rPr>
-                <w:rFonts w:cs="Arial"/>
+              <w:rPr>
+                <w:rFonts w:ascii="Times New Roman" w:hAnsi="Times New Roman" w:cs="Times New Roman"/>
+              </w:rPr>
+            </w:pPr>
+            <w:r>
+              <w:rPr>
+                <w:rFonts w:ascii="Times New Roman" w:hAnsi="Times New Roman" w:cs="Times New Roman"/>
                 <w:b/>
                 <w:bCs/>
                 <w:color w:val="FFFFFF"/>
@@ -314,10 +470,13 @@
             <w:pPr>
               <w:spacing w:before="40"/>
               <w:jc w:val="center"/>
-            </w:pPr>
-            <w:r>
-              <w:rPr>
-                <w:rFonts w:cs="Arial"/>
+              <w:rPr>
+                <w:rFonts w:ascii="Times New Roman" w:hAnsi="Times New Roman" w:cs="Times New Roman"/>
+              </w:rPr>
+            </w:pPr>
+            <w:r>
+              <w:rPr>
+                <w:rFonts w:ascii="Times New Roman" w:hAnsi="Times New Roman" w:cs="Times New Roman"/>
                 <w:color w:val="BDD7EE"/>
                 <w:sz w:val="18"/>
                 <w:szCs w:val="18"/>
@@ -330,8 +489,105 @@
     </w:tbl>
     <w:p>
       <w:pPr>
-        <w:spacing w:before="200" w:after="200"/>
+        <w:pBdr>
+          <w:bottom w:val="single" w:sz="6" w:space="1" w:color="2E75B6"/>
+        </w:pBdr>
+        <w:spacing w:before="280" w:after="100"/>
+        <w:rPr>
+          <w:rFonts w:ascii="Times New Roman" w:hAnsi="Times New Roman" w:cs="Times New Roman"/>
+        </w:rPr>
       </w:pPr>
+      <w:r>
+        <w:rPr>
+          <w:rFonts w:ascii="Times New Roman" w:hAnsi="Times New Roman" w:cs="Times New Roman"/>
+          <w:b/>
+          <w:bCs/>
+          <w:color w:val="1F4E79"/>
+          <w:sz w:val="28"/>
+          <w:szCs w:val="28"/>
+        </w:rPr>
+        <w:t>Executive Summary</w:t>
+      </w:r>
+    </w:p>
+    <w:p>
+      <w:pPr>
+        <w:spacing w:before="60" w:after="60"/>
+        <w:jc w:val="both"/>
+        <w:rPr>
+          <w:rFonts w:ascii="Times New Roman" w:hAnsi="Times New Roman" w:cs="Times New Roman"/>
+          <w:sz w:val="22"/>
+          <w:szCs w:val="22"/>
+        </w:rPr>
+      </w:pPr>
+      <w:r>
+        <w:rPr>
+          <w:rFonts w:ascii="Times New Roman" w:hAnsi="Times New Roman" w:cs="Times New Roman"/>
+          <w:color w:val="222222"/>
+          <w:sz w:val="22"/>
+          <w:szCs w:val="22"/>
+        </w:rPr>
+        <w:t xml:space="preserve">This study analyses monthly fuel consumption patterns among 567 households in Phaltan, Maharashtra, </w:t>
+      </w:r>
+      <w:proofErr w:type="gramStart"/>
+      <w:r>
+        <w:rPr>
+          <w:rFonts w:ascii="Times New Roman" w:hAnsi="Times New Roman" w:cs="Times New Roman"/>
+          <w:color w:val="222222"/>
+          <w:sz w:val="22"/>
+          <w:szCs w:val="22"/>
+        </w:rPr>
+        <w:t>using</w:t>
+      </w:r>
+      <w:proofErr w:type="gramEnd"/>
+      <w:r>
+        <w:rPr>
+          <w:rFonts w:ascii="Times New Roman" w:hAnsi="Times New Roman" w:cs="Times New Roman"/>
+          <w:color w:val="222222"/>
+          <w:sz w:val="22"/>
+          <w:szCs w:val="22"/>
+        </w:rPr>
+        <w:t xml:space="preserve"> primary survey data. The dataset comprised 30 variables covering household demographics, vehicle ownership, income, and fuel expenditure patterns.</w:t>
+      </w:r>
+    </w:p>
+    <w:p>
+      <w:pPr>
+        <w:spacing w:before="60" w:after="60"/>
+        <w:jc w:val="both"/>
+        <w:rPr>
+          <w:rFonts w:ascii="Times New Roman" w:hAnsi="Times New Roman" w:cs="Times New Roman"/>
+          <w:sz w:val="22"/>
+          <w:szCs w:val="22"/>
+        </w:rPr>
+      </w:pPr>
+      <w:r>
+        <w:rPr>
+          <w:rFonts w:ascii="Times New Roman" w:hAnsi="Times New Roman" w:cs="Times New Roman"/>
+          <w:color w:val="222222"/>
+          <w:sz w:val="22"/>
+          <w:szCs w:val="22"/>
+        </w:rPr>
+        <w:t>Multiple regression analysis (Adjusted R² = 0.5176) identified number of vehicles owned as the single strongest predictor of fuel consumption (β = ₹2,716 per vehicle, p ≈ 0), followed by home-to-work distance (β = ₹88/km) and family size (β = ₹375/member). All four predictor variables were statistically significant.</w:t>
+      </w:r>
+    </w:p>
+    <w:p>
+      <w:pPr>
+        <w:spacing w:before="60" w:after="60"/>
+        <w:jc w:val="both"/>
+        <w:rPr>
+          <w:rFonts w:ascii="Times New Roman" w:hAnsi="Times New Roman" w:cs="Times New Roman"/>
+          <w:sz w:val="22"/>
+          <w:szCs w:val="22"/>
+        </w:rPr>
+      </w:pPr>
+      <w:r>
+        <w:rPr>
+          <w:rFonts w:ascii="Times New Roman" w:hAnsi="Times New Roman" w:cs="Times New Roman"/>
+          <w:color w:val="222222"/>
+          <w:sz w:val="22"/>
+          <w:szCs w:val="22"/>
+        </w:rPr>
+        <w:t>Statistical testing confirmed highly significant relationships across all four hypothesis tests (p &lt; 0.05). The study recommends promoting electric two-wheelers, improving public transport connectivity, and introducing vehicle-sharing initiatives to reduce per-household fuel dependency in Phaltan.</w:t>
+      </w:r>
     </w:p>
     <w:p>
       <w:pPr>
@@ -339,73 +595,13 @@
           <w:bottom w:val="single" w:sz="6" w:space="1" w:color="2E75B6"/>
         </w:pBdr>
         <w:spacing w:before="280" w:after="100"/>
+        <w:rPr>
+          <w:rFonts w:ascii="Times New Roman" w:hAnsi="Times New Roman" w:cs="Times New Roman"/>
+        </w:rPr>
       </w:pPr>
       <w:r>
         <w:rPr>
-          <w:rFonts w:cs="Arial"/>
-          <w:b/>
-          <w:bCs/>
-          <w:color w:val="1F4E79"/>
-          <w:sz w:val="28"/>
-          <w:szCs w:val="28"/>
-        </w:rPr>
-        <w:t>Executive Summary</w:t>
-      </w:r>
-    </w:p>
-    <w:p>
-      <w:pPr>
-        <w:spacing w:before="60" w:after="60"/>
-        <w:jc w:val="both"/>
-      </w:pPr>
-      <w:r>
-        <w:rPr>
-          <w:rFonts w:cs="Arial"/>
-          <w:color w:val="222222"/>
-        </w:rPr>
-        <w:t>This study analyses monthly fuel consumption patterns among 567 households in Phaltan, Maharashtra, using primary survey data. The dataset comprised 30 variables covering household demographics, vehicle ownership, income, and fuel expenditure patterns.</w:t>
-      </w:r>
-    </w:p>
-    <w:p>
-      <w:pPr>
-        <w:spacing w:before="60" w:after="60"/>
-        <w:jc w:val="both"/>
-      </w:pPr>
-      <w:r>
-        <w:rPr>
-          <w:rFonts w:cs="Arial"/>
-          <w:color w:val="222222"/>
-        </w:rPr>
-        <w:t>Multiple regression analysis (Adjusted R² = 0.5176) identified number of vehicles owned as the single strongest predictor of fuel consumption (β = ₹2,716 per vehicle, p ≈ 0), followed by home-to-work distance (β = ₹88/km) and family size (β = ₹375/member). All four predictor variables were statistically significant.</w:t>
-      </w:r>
-    </w:p>
-    <w:p>
-      <w:pPr>
-        <w:spacing w:before="60" w:after="60"/>
-        <w:jc w:val="both"/>
-      </w:pPr>
-      <w:r>
-        <w:rPr>
-          <w:rFonts w:cs="Arial"/>
-          <w:color w:val="222222"/>
-        </w:rPr>
-        <w:t>Statistical testing confirmed highly significant relationships across all four hypothesis tests (p &lt; 0.05). The study recommends promoting electric two-wheelers, improving public transport connectivity, and introducing vehicle-sharing initiatives to reduce per-household fuel dependency in Phaltan.</w:t>
-      </w:r>
-    </w:p>
-    <w:p>
-      <w:pPr>
-        <w:spacing w:before="120" w:after="120"/>
-      </w:pPr>
-    </w:p>
-    <w:p>
-      <w:pPr>
-        <w:pBdr>
-          <w:bottom w:val="single" w:sz="6" w:space="1" w:color="2E75B6"/>
-        </w:pBdr>
-        <w:spacing w:before="280" w:after="100"/>
-      </w:pPr>
-      <w:r>
-        <w:rPr>
-          <w:rFonts w:cs="Arial"/>
+          <w:rFonts w:ascii="Times New Roman" w:hAnsi="Times New Roman" w:cs="Times New Roman"/>
           <w:b/>
           <w:bCs/>
           <w:color w:val="1F4E79"/>
@@ -418,10 +614,13 @@
     <w:p>
       <w:pPr>
         <w:spacing w:before="200" w:after="80"/>
+        <w:rPr>
+          <w:rFonts w:ascii="Times New Roman" w:hAnsi="Times New Roman" w:cs="Times New Roman"/>
+        </w:rPr>
       </w:pPr>
       <w:r>
         <w:rPr>
-          <w:rFonts w:cs="Arial"/>
+          <w:rFonts w:ascii="Times New Roman" w:hAnsi="Times New Roman" w:cs="Times New Roman"/>
           <w:b/>
           <w:bCs/>
           <w:color w:val="2E75B6"/>
@@ -475,12 +674,21 @@
             <w:vAlign w:val="center"/>
           </w:tcPr>
           <w:p>
-            <w:r>
-              <w:rPr>
-                <w:rFonts w:cs="Arial"/>
+            <w:pPr>
+              <w:rPr>
+                <w:rFonts w:ascii="Times New Roman" w:hAnsi="Times New Roman" w:cs="Times New Roman"/>
+                <w:sz w:val="24"/>
+                <w:szCs w:val="24"/>
+              </w:rPr>
+            </w:pPr>
+            <w:r>
+              <w:rPr>
+                <w:rFonts w:ascii="Times New Roman" w:hAnsi="Times New Roman" w:cs="Times New Roman"/>
                 <w:b/>
                 <w:bCs/>
                 <w:color w:val="FFFFFF"/>
+                <w:sz w:val="24"/>
+                <w:szCs w:val="24"/>
               </w:rPr>
               <w:t>Vehicle Type</w:t>
             </w:r>
@@ -505,12 +713,21 @@
             <w:vAlign w:val="center"/>
           </w:tcPr>
           <w:p>
-            <w:r>
-              <w:rPr>
-                <w:rFonts w:cs="Arial"/>
+            <w:pPr>
+              <w:rPr>
+                <w:rFonts w:ascii="Times New Roman" w:hAnsi="Times New Roman" w:cs="Times New Roman"/>
+                <w:sz w:val="24"/>
+                <w:szCs w:val="24"/>
+              </w:rPr>
+            </w:pPr>
+            <w:r>
+              <w:rPr>
+                <w:rFonts w:ascii="Times New Roman" w:hAnsi="Times New Roman" w:cs="Times New Roman"/>
                 <w:b/>
                 <w:bCs/>
                 <w:color w:val="FFFFFF"/>
+                <w:sz w:val="24"/>
+                <w:szCs w:val="24"/>
               </w:rPr>
               <w:t>Avg Monthly Fuel (L)</w:t>
             </w:r>
@@ -535,12 +752,21 @@
             <w:vAlign w:val="center"/>
           </w:tcPr>
           <w:p>
-            <w:r>
-              <w:rPr>
-                <w:rFonts w:cs="Arial"/>
+            <w:pPr>
+              <w:rPr>
+                <w:rFonts w:ascii="Times New Roman" w:hAnsi="Times New Roman" w:cs="Times New Roman"/>
+                <w:sz w:val="24"/>
+                <w:szCs w:val="24"/>
+              </w:rPr>
+            </w:pPr>
+            <w:r>
+              <w:rPr>
+                <w:rFonts w:ascii="Times New Roman" w:hAnsi="Times New Roman" w:cs="Times New Roman"/>
                 <w:b/>
                 <w:bCs/>
                 <w:color w:val="FFFFFF"/>
+                <w:sz w:val="24"/>
+                <w:szCs w:val="24"/>
               </w:rPr>
               <w:t>Avg Expense (₹/month)</w:t>
             </w:r>
@@ -565,12 +791,21 @@
             <w:vAlign w:val="center"/>
           </w:tcPr>
           <w:p>
-            <w:r>
-              <w:rPr>
-                <w:rFonts w:cs="Arial"/>
+            <w:pPr>
+              <w:rPr>
+                <w:rFonts w:ascii="Times New Roman" w:hAnsi="Times New Roman" w:cs="Times New Roman"/>
+                <w:sz w:val="24"/>
+                <w:szCs w:val="24"/>
+              </w:rPr>
+            </w:pPr>
+            <w:r>
+              <w:rPr>
+                <w:rFonts w:ascii="Times New Roman" w:hAnsi="Times New Roman" w:cs="Times New Roman"/>
                 <w:b/>
                 <w:bCs/>
                 <w:color w:val="FFFFFF"/>
+                <w:sz w:val="24"/>
+                <w:szCs w:val="24"/>
               </w:rPr>
               <w:t>Relative Consumption</w:t>
             </w:r>
@@ -597,10 +832,19 @@
             <w:vAlign w:val="center"/>
           </w:tcPr>
           <w:p>
-            <w:r>
-              <w:rPr>
-                <w:rFonts w:cs="Arial"/>
+            <w:pPr>
+              <w:rPr>
+                <w:rFonts w:ascii="Times New Roman" w:hAnsi="Times New Roman" w:cs="Times New Roman"/>
+                <w:sz w:val="24"/>
+                <w:szCs w:val="24"/>
+              </w:rPr>
+            </w:pPr>
+            <w:r>
+              <w:rPr>
+                <w:rFonts w:ascii="Times New Roman" w:hAnsi="Times New Roman" w:cs="Times New Roman"/>
                 <w:color w:val="000000"/>
+                <w:sz w:val="24"/>
+                <w:szCs w:val="24"/>
               </w:rPr>
               <w:t>Bike (2-Wheeler)</w:t>
             </w:r>
@@ -625,10 +869,19 @@
             <w:vAlign w:val="center"/>
           </w:tcPr>
           <w:p>
-            <w:r>
-              <w:rPr>
-                <w:rFonts w:cs="Arial"/>
+            <w:pPr>
+              <w:rPr>
+                <w:rFonts w:ascii="Times New Roman" w:hAnsi="Times New Roman" w:cs="Times New Roman"/>
+                <w:sz w:val="24"/>
+                <w:szCs w:val="24"/>
+              </w:rPr>
+            </w:pPr>
+            <w:r>
+              <w:rPr>
+                <w:rFonts w:ascii="Times New Roman" w:hAnsi="Times New Roman" w:cs="Times New Roman"/>
                 <w:color w:val="000000"/>
+                <w:sz w:val="24"/>
+                <w:szCs w:val="24"/>
               </w:rPr>
               <w:t>10.50 L/month</w:t>
             </w:r>
@@ -653,12 +906,21 @@
             <w:vAlign w:val="center"/>
           </w:tcPr>
           <w:p>
-            <w:r>
-              <w:rPr>
-                <w:rFonts w:cs="Arial"/>
+            <w:pPr>
+              <w:rPr>
+                <w:rFonts w:ascii="Times New Roman" w:hAnsi="Times New Roman" w:cs="Times New Roman"/>
+                <w:sz w:val="24"/>
+                <w:szCs w:val="24"/>
+              </w:rPr>
+            </w:pPr>
+            <w:r>
+              <w:rPr>
+                <w:rFonts w:ascii="Times New Roman" w:hAnsi="Times New Roman" w:cs="Times New Roman"/>
                 <w:b/>
                 <w:bCs/>
                 <w:color w:val="1F4E79"/>
+                <w:sz w:val="24"/>
+                <w:szCs w:val="24"/>
               </w:rPr>
               <w:t>₹4,116</w:t>
             </w:r>
@@ -683,10 +945,19 @@
             <w:vAlign w:val="center"/>
           </w:tcPr>
           <w:p>
-            <w:r>
-              <w:rPr>
-                <w:rFonts w:cs="Arial"/>
+            <w:pPr>
+              <w:rPr>
+                <w:rFonts w:ascii="Times New Roman" w:hAnsi="Times New Roman" w:cs="Times New Roman"/>
+                <w:sz w:val="24"/>
+                <w:szCs w:val="24"/>
+              </w:rPr>
+            </w:pPr>
+            <w:r>
+              <w:rPr>
+                <w:rFonts w:ascii="Times New Roman" w:hAnsi="Times New Roman" w:cs="Times New Roman"/>
                 <w:color w:val="000000"/>
+                <w:sz w:val="24"/>
+                <w:szCs w:val="24"/>
               </w:rPr>
               <w:t>Moderate ↑</w:t>
             </w:r>
@@ -713,10 +984,19 @@
             <w:vAlign w:val="center"/>
           </w:tcPr>
           <w:p>
-            <w:r>
-              <w:rPr>
-                <w:rFonts w:cs="Arial"/>
+            <w:pPr>
+              <w:rPr>
+                <w:rFonts w:ascii="Times New Roman" w:hAnsi="Times New Roman" w:cs="Times New Roman"/>
+                <w:sz w:val="24"/>
+                <w:szCs w:val="24"/>
+              </w:rPr>
+            </w:pPr>
+            <w:r>
+              <w:rPr>
+                <w:rFonts w:ascii="Times New Roman" w:hAnsi="Times New Roman" w:cs="Times New Roman"/>
                 <w:color w:val="000000"/>
+                <w:sz w:val="24"/>
+                <w:szCs w:val="24"/>
               </w:rPr>
               <w:t>Scooty (2-Wheeler)</w:t>
             </w:r>
@@ -741,10 +1021,19 @@
             <w:vAlign w:val="center"/>
           </w:tcPr>
           <w:p>
-            <w:r>
-              <w:rPr>
-                <w:rFonts w:cs="Arial"/>
+            <w:pPr>
+              <w:rPr>
+                <w:rFonts w:ascii="Times New Roman" w:hAnsi="Times New Roman" w:cs="Times New Roman"/>
+                <w:sz w:val="24"/>
+                <w:szCs w:val="24"/>
+              </w:rPr>
+            </w:pPr>
+            <w:r>
+              <w:rPr>
+                <w:rFonts w:ascii="Times New Roman" w:hAnsi="Times New Roman" w:cs="Times New Roman"/>
                 <w:color w:val="000000"/>
+                <w:sz w:val="24"/>
+                <w:szCs w:val="24"/>
               </w:rPr>
               <w:t>7.14 L/month</w:t>
             </w:r>
@@ -769,12 +1058,21 @@
             <w:vAlign w:val="center"/>
           </w:tcPr>
           <w:p>
-            <w:r>
-              <w:rPr>
-                <w:rFonts w:cs="Arial"/>
+            <w:pPr>
+              <w:rPr>
+                <w:rFonts w:ascii="Times New Roman" w:hAnsi="Times New Roman" w:cs="Times New Roman"/>
+                <w:sz w:val="24"/>
+                <w:szCs w:val="24"/>
+              </w:rPr>
+            </w:pPr>
+            <w:r>
+              <w:rPr>
+                <w:rFonts w:ascii="Times New Roman" w:hAnsi="Times New Roman" w:cs="Times New Roman"/>
                 <w:b/>
                 <w:bCs/>
                 <w:color w:val="1F4E79"/>
+                <w:sz w:val="24"/>
+                <w:szCs w:val="24"/>
               </w:rPr>
               <w:t>₹1,413</w:t>
             </w:r>
@@ -799,10 +1097,19 @@
             <w:vAlign w:val="center"/>
           </w:tcPr>
           <w:p>
-            <w:r>
-              <w:rPr>
-                <w:rFonts w:cs="Arial"/>
+            <w:pPr>
+              <w:rPr>
+                <w:rFonts w:ascii="Times New Roman" w:hAnsi="Times New Roman" w:cs="Times New Roman"/>
+                <w:sz w:val="24"/>
+                <w:szCs w:val="24"/>
+              </w:rPr>
+            </w:pPr>
+            <w:r>
+              <w:rPr>
+                <w:rFonts w:ascii="Times New Roman" w:hAnsi="Times New Roman" w:cs="Times New Roman"/>
                 <w:color w:val="375623"/>
+                <w:sz w:val="24"/>
+                <w:szCs w:val="24"/>
               </w:rPr>
               <w:t>Low ↓</w:t>
             </w:r>
@@ -829,10 +1136,19 @@
             <w:vAlign w:val="center"/>
           </w:tcPr>
           <w:p>
-            <w:r>
-              <w:rPr>
-                <w:rFonts w:cs="Arial"/>
+            <w:pPr>
+              <w:rPr>
+                <w:rFonts w:ascii="Times New Roman" w:hAnsi="Times New Roman" w:cs="Times New Roman"/>
+                <w:sz w:val="24"/>
+                <w:szCs w:val="24"/>
+              </w:rPr>
+            </w:pPr>
+            <w:r>
+              <w:rPr>
+                <w:rFonts w:ascii="Times New Roman" w:hAnsi="Times New Roman" w:cs="Times New Roman"/>
                 <w:color w:val="000000"/>
+                <w:sz w:val="24"/>
+                <w:szCs w:val="24"/>
               </w:rPr>
               <w:t>Car (4-Wheeler)</w:t>
             </w:r>
@@ -857,10 +1173,19 @@
             <w:vAlign w:val="center"/>
           </w:tcPr>
           <w:p>
-            <w:r>
-              <w:rPr>
-                <w:rFonts w:cs="Arial"/>
+            <w:pPr>
+              <w:rPr>
+                <w:rFonts w:ascii="Times New Roman" w:hAnsi="Times New Roman" w:cs="Times New Roman"/>
+                <w:sz w:val="24"/>
+                <w:szCs w:val="24"/>
+              </w:rPr>
+            </w:pPr>
+            <w:r>
+              <w:rPr>
+                <w:rFonts w:ascii="Times New Roman" w:hAnsi="Times New Roman" w:cs="Times New Roman"/>
                 <w:color w:val="000000"/>
+                <w:sz w:val="24"/>
+                <w:szCs w:val="24"/>
               </w:rPr>
               <w:t>27.20 L/month</w:t>
             </w:r>
@@ -885,12 +1210,21 @@
             <w:vAlign w:val="center"/>
           </w:tcPr>
           <w:p>
-            <w:r>
-              <w:rPr>
-                <w:rFonts w:cs="Arial"/>
+            <w:pPr>
+              <w:rPr>
+                <w:rFonts w:ascii="Times New Roman" w:hAnsi="Times New Roman" w:cs="Times New Roman"/>
+                <w:sz w:val="24"/>
+                <w:szCs w:val="24"/>
+              </w:rPr>
+            </w:pPr>
+            <w:r>
+              <w:rPr>
+                <w:rFonts w:ascii="Times New Roman" w:hAnsi="Times New Roman" w:cs="Times New Roman"/>
                 <w:b/>
                 <w:bCs/>
                 <w:color w:val="1F4E79"/>
+                <w:sz w:val="24"/>
+                <w:szCs w:val="24"/>
               </w:rPr>
               <w:t>₹5,117</w:t>
             </w:r>
@@ -915,10 +1249,19 @@
             <w:vAlign w:val="center"/>
           </w:tcPr>
           <w:p>
-            <w:r>
-              <w:rPr>
-                <w:rFonts w:cs="Arial"/>
+            <w:pPr>
+              <w:rPr>
+                <w:rFonts w:ascii="Times New Roman" w:hAnsi="Times New Roman" w:cs="Times New Roman"/>
+                <w:sz w:val="24"/>
+                <w:szCs w:val="24"/>
+              </w:rPr>
+            </w:pPr>
+            <w:r>
+              <w:rPr>
+                <w:rFonts w:ascii="Times New Roman" w:hAnsi="Times New Roman" w:cs="Times New Roman"/>
                 <w:color w:val="7F6000"/>
+                <w:sz w:val="24"/>
+                <w:szCs w:val="24"/>
               </w:rPr>
               <w:t>High ↑↑</w:t>
             </w:r>
@@ -945,10 +1288,19 @@
             <w:vAlign w:val="center"/>
           </w:tcPr>
           <w:p>
-            <w:r>
-              <w:rPr>
-                <w:rFonts w:cs="Arial"/>
+            <w:pPr>
+              <w:rPr>
+                <w:rFonts w:ascii="Times New Roman" w:hAnsi="Times New Roman" w:cs="Times New Roman"/>
+                <w:sz w:val="24"/>
+                <w:szCs w:val="24"/>
+              </w:rPr>
+            </w:pPr>
+            <w:r>
+              <w:rPr>
+                <w:rFonts w:ascii="Times New Roman" w:hAnsi="Times New Roman" w:cs="Times New Roman"/>
                 <w:color w:val="000000"/>
+                <w:sz w:val="24"/>
+                <w:szCs w:val="24"/>
               </w:rPr>
               <w:t>Commercial Vehicle</w:t>
             </w:r>
@@ -973,10 +1325,19 @@
             <w:vAlign w:val="center"/>
           </w:tcPr>
           <w:p>
-            <w:r>
-              <w:rPr>
-                <w:rFonts w:cs="Arial"/>
+            <w:pPr>
+              <w:rPr>
+                <w:rFonts w:ascii="Times New Roman" w:hAnsi="Times New Roman" w:cs="Times New Roman"/>
+                <w:sz w:val="24"/>
+                <w:szCs w:val="24"/>
+              </w:rPr>
+            </w:pPr>
+            <w:r>
+              <w:rPr>
+                <w:rFonts w:ascii="Times New Roman" w:hAnsi="Times New Roman" w:cs="Times New Roman"/>
                 <w:color w:val="000000"/>
+                <w:sz w:val="24"/>
+                <w:szCs w:val="24"/>
               </w:rPr>
               <w:t>69.10 L/month</w:t>
             </w:r>
@@ -1001,12 +1362,21 @@
             <w:vAlign w:val="center"/>
           </w:tcPr>
           <w:p>
-            <w:r>
-              <w:rPr>
-                <w:rFonts w:cs="Arial"/>
+            <w:pPr>
+              <w:rPr>
+                <w:rFonts w:ascii="Times New Roman" w:hAnsi="Times New Roman" w:cs="Times New Roman"/>
+                <w:sz w:val="24"/>
+                <w:szCs w:val="24"/>
+              </w:rPr>
+            </w:pPr>
+            <w:r>
+              <w:rPr>
+                <w:rFonts w:ascii="Times New Roman" w:hAnsi="Times New Roman" w:cs="Times New Roman"/>
                 <w:b/>
                 <w:bCs/>
                 <w:color w:val="A32D2D"/>
+                <w:sz w:val="24"/>
+                <w:szCs w:val="24"/>
               </w:rPr>
               <w:t>₹9,236</w:t>
             </w:r>
@@ -1031,10 +1401,19 @@
             <w:vAlign w:val="center"/>
           </w:tcPr>
           <w:p>
-            <w:r>
-              <w:rPr>
-                <w:rFonts w:cs="Arial"/>
+            <w:pPr>
+              <w:rPr>
+                <w:rFonts w:ascii="Times New Roman" w:hAnsi="Times New Roman" w:cs="Times New Roman"/>
+                <w:sz w:val="24"/>
+                <w:szCs w:val="24"/>
+              </w:rPr>
+            </w:pPr>
+            <w:r>
+              <w:rPr>
+                <w:rFonts w:ascii="Times New Roman" w:hAnsi="Times New Roman" w:cs="Times New Roman"/>
                 <w:color w:val="A32D2D"/>
+                <w:sz w:val="24"/>
+                <w:szCs w:val="24"/>
               </w:rPr>
               <w:t>Highest ↑↑↑</w:t>
             </w:r>
@@ -1045,6 +1424,11 @@
     <w:p>
       <w:pPr>
         <w:spacing w:before="80" w:after="80"/>
+        <w:rPr>
+          <w:rFonts w:ascii="Times New Roman" w:hAnsi="Times New Roman" w:cs="Times New Roman"/>
+          <w:sz w:val="24"/>
+          <w:szCs w:val="24"/>
+        </w:rPr>
       </w:pPr>
     </w:p>
     <w:tbl>
@@ -1090,15 +1474,21 @@
           <w:p>
             <w:pPr>
               <w:spacing w:after="60"/>
-            </w:pPr>
-            <w:r>
-              <w:rPr>
-                <w:rFonts w:cs="Arial"/>
+              <w:jc w:val="both"/>
+              <w:rPr>
+                <w:rFonts w:ascii="Times New Roman" w:hAnsi="Times New Roman" w:cs="Times New Roman"/>
+                <w:sz w:val="24"/>
+                <w:szCs w:val="24"/>
+              </w:rPr>
+            </w:pPr>
+            <w:r>
+              <w:rPr>
+                <w:rFonts w:ascii="Times New Roman" w:hAnsi="Times New Roman" w:cs="Times New Roman"/>
                 <w:b/>
                 <w:bCs/>
                 <w:color w:val="1F4E79"/>
-                <w:sz w:val="21"/>
-                <w:szCs w:val="21"/>
+                <w:sz w:val="24"/>
+                <w:szCs w:val="24"/>
               </w:rPr>
               <w:t>Income vs Fuel Correlation</w:t>
             </w:r>
@@ -1106,10 +1496,14 @@
           <w:p>
             <w:pPr>
               <w:spacing w:after="40"/>
-            </w:pPr>
-            <w:r>
-              <w:rPr>
-                <w:rFonts w:cs="Arial"/>
+              <w:jc w:val="both"/>
+              <w:rPr>
+                <w:rFonts w:ascii="Times New Roman" w:hAnsi="Times New Roman" w:cs="Times New Roman"/>
+              </w:rPr>
+            </w:pPr>
+            <w:r>
+              <w:rPr>
+                <w:rFonts w:ascii="Times New Roman" w:hAnsi="Times New Roman" w:cs="Times New Roman"/>
                 <w:b/>
                 <w:bCs/>
                 <w:color w:val="2E75B6"/>
@@ -1120,12 +1514,13 @@
             </w:r>
           </w:p>
           <w:p>
-            <w:r>
-              <w:rPr>
-                <w:rFonts w:cs="Arial"/>
+            <w:pPr>
+              <w:jc w:val="both"/>
+            </w:pPr>
+            <w:r>
+              <w:rPr>
+                <w:rFonts w:ascii="Times New Roman" w:hAnsi="Times New Roman" w:cs="Times New Roman"/>
                 <w:color w:val="595959"/>
-                <w:sz w:val="18"/>
-                <w:szCs w:val="18"/>
               </w:rPr>
               <w:t>Moderate positive relationship — higher income households spend significantly more on fuel</w:t>
             </w:r>
@@ -1150,27 +1545,51 @@
           </w:tcPr>
           <w:p>
             <w:pPr>
+              <w:tabs>
+                <w:tab w:val="left" w:pos="2558"/>
+              </w:tabs>
               <w:spacing w:after="60"/>
-            </w:pPr>
-            <w:r>
-              <w:rPr>
-                <w:rFonts w:cs="Arial"/>
+              <w:jc w:val="both"/>
+              <w:rPr>
+                <w:rFonts w:ascii="Times New Roman" w:hAnsi="Times New Roman" w:cs="Times New Roman"/>
+                <w:sz w:val="24"/>
+                <w:szCs w:val="24"/>
+              </w:rPr>
+            </w:pPr>
+            <w:r>
+              <w:rPr>
+                <w:rFonts w:ascii="Times New Roman" w:hAnsi="Times New Roman" w:cs="Times New Roman"/>
                 <w:b/>
                 <w:bCs/>
                 <w:color w:val="1F4E79"/>
-                <w:sz w:val="21"/>
-                <w:szCs w:val="21"/>
+                <w:sz w:val="24"/>
+                <w:szCs w:val="24"/>
               </w:rPr>
               <w:t>Per Capita Fuel Expense</w:t>
             </w:r>
+            <w:r>
+              <w:rPr>
+                <w:rFonts w:ascii="Times New Roman" w:hAnsi="Times New Roman" w:cs="Times New Roman"/>
+                <w:b/>
+                <w:bCs/>
+                <w:color w:val="1F4E79"/>
+                <w:sz w:val="24"/>
+                <w:szCs w:val="24"/>
+              </w:rPr>
+              <w:tab/>
+            </w:r>
           </w:p>
           <w:p>
             <w:pPr>
               <w:spacing w:after="40"/>
-            </w:pPr>
-            <w:r>
-              <w:rPr>
-                <w:rFonts w:cs="Arial"/>
+              <w:jc w:val="both"/>
+              <w:rPr>
+                <w:rFonts w:ascii="Times New Roman" w:hAnsi="Times New Roman" w:cs="Times New Roman"/>
+              </w:rPr>
+            </w:pPr>
+            <w:r>
+              <w:rPr>
+                <w:rFonts w:ascii="Times New Roman" w:hAnsi="Times New Roman" w:cs="Times New Roman"/>
                 <w:b/>
                 <w:bCs/>
                 <w:color w:val="7F6000"/>
@@ -1181,12 +1600,13 @@
             </w:r>
           </w:p>
           <w:p>
-            <w:r>
-              <w:rPr>
-                <w:rFonts w:cs="Arial"/>
+            <w:pPr>
+              <w:jc w:val="both"/>
+            </w:pPr>
+            <w:r>
+              <w:rPr>
+                <w:rFonts w:ascii="Times New Roman" w:hAnsi="Times New Roman" w:cs="Times New Roman"/>
                 <w:color w:val="595959"/>
-                <w:sz w:val="18"/>
-                <w:szCs w:val="18"/>
               </w:rPr>
               <w:t>Average per person per month | Median: ₹400 | Distribution: Right-skewed</w:t>
             </w:r>
@@ -1194,11 +1614,6 @@
         </w:tc>
       </w:tr>
     </w:tbl>
-    <w:p>
-      <w:pPr>
-        <w:spacing w:before="160" w:after="160"/>
-      </w:pPr>
-    </w:p>
     <w:p>
       <w:pPr>
         <w:spacing w:before="160" w:after="160"/>
@@ -1215,16 +1630,20 @@
           <w:bottom w:val="single" w:sz="6" w:space="1" w:color="2E75B6"/>
         </w:pBdr>
         <w:spacing w:before="280" w:after="100"/>
+        <w:rPr>
+          <w:rFonts w:ascii="Times New Roman" w:hAnsi="Times New Roman" w:cs="Times New Roman"/>
+        </w:rPr>
       </w:pPr>
       <w:r>
         <w:rPr>
-          <w:rFonts w:cs="Arial"/>
+          <w:rFonts w:ascii="Times New Roman" w:hAnsi="Times New Roman" w:cs="Times New Roman"/>
           <w:b/>
           <w:bCs/>
           <w:color w:val="1F4E79"/>
           <w:sz w:val="28"/>
           <w:szCs w:val="28"/>
         </w:rPr>
+        <w:lastRenderedPageBreak/>
         <w:t>Hypothesis Testing Summary</w:t>
       </w:r>
     </w:p>
@@ -1234,10 +1653,19 @@
       </w:pPr>
       <w:r>
         <w:rPr>
+          <w:rFonts w:ascii="Times New Roman" w:hAnsi="Times New Roman" w:cs="Times New Roman"/>
+          <w:color w:val="222222"/>
+          <w:sz w:val="24"/>
+          <w:szCs w:val="24"/>
+        </w:rPr>
+        <w:t>Four hypothesis tests were conducted at α = 0.05 significance level. All four tests confirmed statistically significant relationships</w:t>
+      </w:r>
+      <w:r>
+        <w:rPr>
           <w:rFonts w:cs="Arial"/>
           <w:color w:val="222222"/>
         </w:rPr>
-        <w:t>Four hypothesis tests were conducted at α = 0.05 significance level. All four tests confirmed statistically significant relationships.</w:t>
+        <w:t>.</w:t>
       </w:r>
     </w:p>
     <w:p>
@@ -1247,7 +1675,7 @@
     </w:p>
     <w:tbl>
       <w:tblPr>
-        <w:tblW w:w="9360" w:type="dxa"/>
+        <w:tblW w:w="9649" w:type="dxa"/>
         <w:tblInd w:w="150" w:type="dxa"/>
         <w:tblBorders>
           <w:top w:val="single" w:sz="4" w:space="0" w:color="auto"/>
@@ -1257,6 +1685,7 @@
           <w:insideH w:val="single" w:sz="4" w:space="0" w:color="auto"/>
           <w:insideV w:val="single" w:sz="4" w:space="0" w:color="auto"/>
         </w:tblBorders>
+        <w:tblLayout w:type="fixed"/>
         <w:tblCellMar>
           <w:left w:w="10" w:type="dxa"/>
           <w:right w:w="10" w:type="dxa"/>
@@ -1264,17 +1693,17 @@
         <w:tblLook w:val="0000" w:firstRow="0" w:lastRow="0" w:firstColumn="0" w:lastColumn="0" w:noHBand="0" w:noVBand="0"/>
       </w:tblPr>
       <w:tblGrid>
-        <w:gridCol w:w="536"/>
-        <w:gridCol w:w="1347"/>
-        <w:gridCol w:w="2103"/>
-        <w:gridCol w:w="2112"/>
-        <w:gridCol w:w="1333"/>
-        <w:gridCol w:w="1929"/>
+        <w:gridCol w:w="575"/>
+        <w:gridCol w:w="1562"/>
+        <w:gridCol w:w="1943"/>
+        <w:gridCol w:w="2309"/>
+        <w:gridCol w:w="1701"/>
+        <w:gridCol w:w="1559"/>
       </w:tblGrid>
       <w:tr>
         <w:tc>
           <w:tcPr>
-            <w:tcW w:w="400" w:type="dxa"/>
+            <w:tcW w:w="575" w:type="dxa"/>
             <w:tcBorders>
               <w:top w:val="single" w:sz="1" w:space="0" w:color="CCCCCC"/>
               <w:left w:val="single" w:sz="1" w:space="0" w:color="CCCCCC"/>
@@ -1291,12 +1720,21 @@
             <w:vAlign w:val="center"/>
           </w:tcPr>
           <w:p>
-            <w:r>
-              <w:rPr>
-                <w:rFonts w:cs="Arial"/>
+            <w:pPr>
+              <w:rPr>
+                <w:rFonts w:ascii="Times New Roman" w:hAnsi="Times New Roman" w:cs="Times New Roman"/>
+                <w:sz w:val="24"/>
+                <w:szCs w:val="24"/>
+              </w:rPr>
+            </w:pPr>
+            <w:r>
+              <w:rPr>
+                <w:rFonts w:ascii="Times New Roman" w:hAnsi="Times New Roman" w:cs="Times New Roman"/>
                 <w:b/>
                 <w:bCs/>
                 <w:color w:val="FFFFFF"/>
+                <w:sz w:val="24"/>
+                <w:szCs w:val="24"/>
               </w:rPr>
               <w:t>#</w:t>
             </w:r>
@@ -1304,7 +1742,7 @@
         </w:tc>
         <w:tc>
           <w:tcPr>
-            <w:tcW w:w="1200" w:type="dxa"/>
+            <w:tcW w:w="1562" w:type="dxa"/>
             <w:tcBorders>
               <w:top w:val="single" w:sz="1" w:space="0" w:color="CCCCCC"/>
               <w:left w:val="single" w:sz="1" w:space="0" w:color="CCCCCC"/>
@@ -1321,12 +1759,21 @@
             <w:vAlign w:val="center"/>
           </w:tcPr>
           <w:p>
-            <w:r>
-              <w:rPr>
-                <w:rFonts w:cs="Arial"/>
+            <w:pPr>
+              <w:rPr>
+                <w:rFonts w:ascii="Times New Roman" w:hAnsi="Times New Roman" w:cs="Times New Roman"/>
+                <w:sz w:val="24"/>
+                <w:szCs w:val="24"/>
+              </w:rPr>
+            </w:pPr>
+            <w:r>
+              <w:rPr>
+                <w:rFonts w:ascii="Times New Roman" w:hAnsi="Times New Roman" w:cs="Times New Roman"/>
                 <w:b/>
                 <w:bCs/>
                 <w:color w:val="FFFFFF"/>
+                <w:sz w:val="24"/>
+                <w:szCs w:val="24"/>
               </w:rPr>
               <w:t>Test</w:t>
             </w:r>
@@ -1334,7 +1781,7 @@
         </w:tc>
         <w:tc>
           <w:tcPr>
-            <w:tcW w:w="2200" w:type="dxa"/>
+            <w:tcW w:w="1943" w:type="dxa"/>
             <w:tcBorders>
               <w:top w:val="single" w:sz="1" w:space="0" w:color="CCCCCC"/>
               <w:left w:val="single" w:sz="1" w:space="0" w:color="CCCCCC"/>
@@ -1351,20 +1798,41 @@
             <w:vAlign w:val="center"/>
           </w:tcPr>
           <w:p>
-            <w:r>
-              <w:rPr>
-                <w:rFonts w:cs="Arial"/>
+            <w:pPr>
+              <w:rPr>
+                <w:rFonts w:ascii="Times New Roman" w:hAnsi="Times New Roman" w:cs="Times New Roman"/>
+                <w:sz w:val="24"/>
+                <w:szCs w:val="24"/>
+              </w:rPr>
+            </w:pPr>
+            <w:r>
+              <w:rPr>
+                <w:rFonts w:ascii="Times New Roman" w:hAnsi="Times New Roman" w:cs="Times New Roman"/>
                 <w:b/>
                 <w:bCs/>
                 <w:color w:val="FFFFFF"/>
-              </w:rPr>
-              <w:t>H₀</w:t>
-            </w:r>
-          </w:p>
-        </w:tc>
-        <w:tc>
-          <w:tcPr>
-            <w:tcW w:w="2200" w:type="dxa"/>
+                <w:sz w:val="24"/>
+                <w:szCs w:val="24"/>
+              </w:rPr>
+              <w:t>H</w:t>
+            </w:r>
+            <w:r>
+              <w:rPr>
+                <w:rFonts w:ascii="Times New Roman" w:hAnsi="Times New Roman" w:cs="Times New Roman"/>
+                <w:b/>
+                <w:bCs/>
+                <w:color w:val="FFFFFF"/>
+                <w:sz w:val="24"/>
+                <w:szCs w:val="24"/>
+                <w:vertAlign w:val="subscript"/>
+              </w:rPr>
+              <w:t>0</w:t>
+            </w:r>
+          </w:p>
+        </w:tc>
+        <w:tc>
+          <w:tcPr>
+            <w:tcW w:w="2309" w:type="dxa"/>
             <w:tcBorders>
               <w:top w:val="single" w:sz="1" w:space="0" w:color="CCCCCC"/>
               <w:left w:val="single" w:sz="1" w:space="0" w:color="CCCCCC"/>
@@ -1381,20 +1849,41 @@
             <w:vAlign w:val="center"/>
           </w:tcPr>
           <w:p>
-            <w:r>
-              <w:rPr>
-                <w:rFonts w:cs="Arial"/>
+            <w:pPr>
+              <w:rPr>
+                <w:rFonts w:ascii="Times New Roman" w:hAnsi="Times New Roman" w:cs="Times New Roman"/>
+                <w:sz w:val="24"/>
+                <w:szCs w:val="24"/>
+              </w:rPr>
+            </w:pPr>
+            <w:r>
+              <w:rPr>
+                <w:rFonts w:ascii="Times New Roman" w:hAnsi="Times New Roman" w:cs="Times New Roman"/>
                 <w:b/>
                 <w:bCs/>
                 <w:color w:val="FFFFFF"/>
-              </w:rPr>
-              <w:t>H₁</w:t>
-            </w:r>
-          </w:p>
-        </w:tc>
-        <w:tc>
-          <w:tcPr>
-            <w:tcW w:w="1360" w:type="dxa"/>
+                <w:sz w:val="24"/>
+                <w:szCs w:val="24"/>
+              </w:rPr>
+              <w:t>H</w:t>
+            </w:r>
+            <w:r>
+              <w:rPr>
+                <w:rFonts w:ascii="Times New Roman" w:hAnsi="Times New Roman" w:cs="Times New Roman"/>
+                <w:b/>
+                <w:bCs/>
+                <w:color w:val="FFFFFF"/>
+                <w:sz w:val="24"/>
+                <w:szCs w:val="24"/>
+                <w:vertAlign w:val="subscript"/>
+              </w:rPr>
+              <w:t>0</w:t>
+            </w:r>
+          </w:p>
+        </w:tc>
+        <w:tc>
+          <w:tcPr>
+            <w:tcW w:w="1701" w:type="dxa"/>
             <w:tcBorders>
               <w:top w:val="single" w:sz="1" w:space="0" w:color="CCCCCC"/>
               <w:left w:val="single" w:sz="1" w:space="0" w:color="CCCCCC"/>
@@ -1411,12 +1900,21 @@
             <w:vAlign w:val="center"/>
           </w:tcPr>
           <w:p>
-            <w:r>
-              <w:rPr>
-                <w:rFonts w:cs="Arial"/>
+            <w:pPr>
+              <w:rPr>
+                <w:rFonts w:ascii="Times New Roman" w:hAnsi="Times New Roman" w:cs="Times New Roman"/>
+                <w:sz w:val="24"/>
+                <w:szCs w:val="24"/>
+              </w:rPr>
+            </w:pPr>
+            <w:r>
+              <w:rPr>
+                <w:rFonts w:ascii="Times New Roman" w:hAnsi="Times New Roman" w:cs="Times New Roman"/>
                 <w:b/>
                 <w:bCs/>
                 <w:color w:val="FFFFFF"/>
+                <w:sz w:val="24"/>
+                <w:szCs w:val="24"/>
               </w:rPr>
               <w:t>Statistic</w:t>
             </w:r>
@@ -1424,7 +1922,7 @@
         </w:tc>
         <w:tc>
           <w:tcPr>
-            <w:tcW w:w="2000" w:type="dxa"/>
+            <w:tcW w:w="1559" w:type="dxa"/>
             <w:tcBorders>
               <w:top w:val="single" w:sz="1" w:space="0" w:color="CCCCCC"/>
               <w:left w:val="single" w:sz="1" w:space="0" w:color="CCCCCC"/>
@@ -1441,12 +1939,21 @@
             <w:vAlign w:val="center"/>
           </w:tcPr>
           <w:p>
-            <w:r>
-              <w:rPr>
-                <w:rFonts w:cs="Arial"/>
+            <w:pPr>
+              <w:rPr>
+                <w:rFonts w:ascii="Times New Roman" w:hAnsi="Times New Roman" w:cs="Times New Roman"/>
+                <w:sz w:val="24"/>
+                <w:szCs w:val="24"/>
+              </w:rPr>
+            </w:pPr>
+            <w:r>
+              <w:rPr>
+                <w:rFonts w:ascii="Times New Roman" w:hAnsi="Times New Roman" w:cs="Times New Roman"/>
                 <w:b/>
                 <w:bCs/>
                 <w:color w:val="FFFFFF"/>
+                <w:sz w:val="24"/>
+                <w:szCs w:val="24"/>
               </w:rPr>
               <w:t>Decision</w:t>
             </w:r>
@@ -1456,7 +1963,7 @@
       <w:tr>
         <w:tc>
           <w:tcPr>
-            <w:tcW w:w="400" w:type="dxa"/>
+            <w:tcW w:w="575" w:type="dxa"/>
             <w:tcBorders>
               <w:top w:val="single" w:sz="1" w:space="0" w:color="CCCCCC"/>
               <w:left w:val="single" w:sz="1" w:space="0" w:color="CCCCCC"/>
@@ -1473,10 +1980,19 @@
             <w:vAlign w:val="center"/>
           </w:tcPr>
           <w:p>
-            <w:r>
-              <w:rPr>
-                <w:rFonts w:cs="Arial"/>
+            <w:pPr>
+              <w:rPr>
+                <w:rFonts w:ascii="Times New Roman" w:hAnsi="Times New Roman" w:cs="Times New Roman"/>
+                <w:sz w:val="24"/>
+                <w:szCs w:val="24"/>
+              </w:rPr>
+            </w:pPr>
+            <w:r>
+              <w:rPr>
+                <w:rFonts w:ascii="Times New Roman" w:hAnsi="Times New Roman" w:cs="Times New Roman"/>
                 <w:color w:val="000000"/>
+                <w:sz w:val="24"/>
+                <w:szCs w:val="24"/>
               </w:rPr>
               <w:t>H1</w:t>
             </w:r>
@@ -1484,7 +2000,7 @@
         </w:tc>
         <w:tc>
           <w:tcPr>
-            <w:tcW w:w="1200" w:type="dxa"/>
+            <w:tcW w:w="1562" w:type="dxa"/>
             <w:tcBorders>
               <w:top w:val="single" w:sz="1" w:space="0" w:color="CCCCCC"/>
               <w:left w:val="single" w:sz="1" w:space="0" w:color="CCCCCC"/>
@@ -1501,12 +2017,21 @@
             <w:vAlign w:val="center"/>
           </w:tcPr>
           <w:p>
-            <w:r>
-              <w:rPr>
-                <w:rFonts w:cs="Arial"/>
+            <w:pPr>
+              <w:rPr>
+                <w:rFonts w:ascii="Times New Roman" w:hAnsi="Times New Roman" w:cs="Times New Roman"/>
+                <w:sz w:val="24"/>
+                <w:szCs w:val="24"/>
+              </w:rPr>
+            </w:pPr>
+            <w:r>
+              <w:rPr>
+                <w:rFonts w:ascii="Times New Roman" w:hAnsi="Times New Roman" w:cs="Times New Roman"/>
                 <w:b/>
                 <w:bCs/>
                 <w:color w:val="000000"/>
+                <w:sz w:val="24"/>
+                <w:szCs w:val="24"/>
               </w:rPr>
               <w:t>T-test</w:t>
             </w:r>
@@ -1514,7 +2039,7 @@
         </w:tc>
         <w:tc>
           <w:tcPr>
-            <w:tcW w:w="2200" w:type="dxa"/>
+            <w:tcW w:w="1943" w:type="dxa"/>
             <w:tcBorders>
               <w:top w:val="single" w:sz="1" w:space="0" w:color="CCCCCC"/>
               <w:left w:val="single" w:sz="1" w:space="0" w:color="CCCCCC"/>
@@ -1531,12 +2056,19 @@
             <w:vAlign w:val="center"/>
           </w:tcPr>
           <w:p>
-            <w:r>
-              <w:rPr>
-                <w:rFonts w:cs="Arial"/>
+            <w:pPr>
+              <w:rPr>
+                <w:rFonts w:ascii="Times New Roman" w:hAnsi="Times New Roman" w:cs="Times New Roman"/>
+                <w:sz w:val="24"/>
+                <w:szCs w:val="24"/>
+              </w:rPr>
+            </w:pPr>
+            <w:r>
+              <w:rPr>
+                <w:rFonts w:ascii="Times New Roman" w:hAnsi="Times New Roman" w:cs="Times New Roman"/>
                 <w:color w:val="000000"/>
-                <w:sz w:val="18"/>
-                <w:szCs w:val="18"/>
+                <w:sz w:val="24"/>
+                <w:szCs w:val="24"/>
               </w:rPr>
               <w:t>No gender difference in fuel spending</w:t>
             </w:r>
@@ -1544,7 +2076,7 @@
         </w:tc>
         <w:tc>
           <w:tcPr>
-            <w:tcW w:w="2200" w:type="dxa"/>
+            <w:tcW w:w="2309" w:type="dxa"/>
             <w:tcBorders>
               <w:top w:val="single" w:sz="1" w:space="0" w:color="CCCCCC"/>
               <w:left w:val="single" w:sz="1" w:space="0" w:color="CCCCCC"/>
@@ -1561,12 +2093,19 @@
             <w:vAlign w:val="center"/>
           </w:tcPr>
           <w:p>
-            <w:r>
-              <w:rPr>
-                <w:rFonts w:cs="Arial"/>
+            <w:pPr>
+              <w:rPr>
+                <w:rFonts w:ascii="Times New Roman" w:hAnsi="Times New Roman" w:cs="Times New Roman"/>
+                <w:sz w:val="24"/>
+                <w:szCs w:val="24"/>
+              </w:rPr>
+            </w:pPr>
+            <w:r>
+              <w:rPr>
+                <w:rFonts w:ascii="Times New Roman" w:hAnsi="Times New Roman" w:cs="Times New Roman"/>
                 <w:color w:val="000000"/>
-                <w:sz w:val="18"/>
-                <w:szCs w:val="18"/>
+                <w:sz w:val="24"/>
+                <w:szCs w:val="24"/>
               </w:rPr>
               <w:t>Males and females differ in fuel spending</w:t>
             </w:r>
@@ -1574,7 +2113,7 @@
         </w:tc>
         <w:tc>
           <w:tcPr>
-            <w:tcW w:w="1360" w:type="dxa"/>
+            <w:tcW w:w="1701" w:type="dxa"/>
             <w:tcBorders>
               <w:top w:val="single" w:sz="1" w:space="0" w:color="CCCCCC"/>
               <w:left w:val="single" w:sz="1" w:space="0" w:color="CCCCCC"/>
@@ -1589,34 +2128,48 @@
             </w:tcMar>
           </w:tcPr>
           <w:p>
-            <w:r>
-              <w:rPr>
-                <w:rFonts w:cs="Arial"/>
+            <w:pPr>
+              <w:rPr>
+                <w:rFonts w:ascii="Times New Roman" w:hAnsi="Times New Roman" w:cs="Times New Roman"/>
+                <w:sz w:val="24"/>
+                <w:szCs w:val="24"/>
+              </w:rPr>
+            </w:pPr>
+            <w:r>
+              <w:rPr>
+                <w:rFonts w:ascii="Times New Roman" w:hAnsi="Times New Roman" w:cs="Times New Roman"/>
                 <w:b/>
                 <w:bCs/>
                 <w:color w:val="1F4E79"/>
-                <w:sz w:val="18"/>
-                <w:szCs w:val="18"/>
+                <w:sz w:val="24"/>
+                <w:szCs w:val="24"/>
               </w:rPr>
               <w:t>t = 12.86</w:t>
             </w:r>
           </w:p>
           <w:p>
-            <w:r>
-              <w:rPr>
-                <w:rFonts w:cs="Arial"/>
+            <w:pPr>
+              <w:rPr>
+                <w:rFonts w:ascii="Times New Roman" w:hAnsi="Times New Roman" w:cs="Times New Roman"/>
+                <w:sz w:val="24"/>
+                <w:szCs w:val="24"/>
+              </w:rPr>
+            </w:pPr>
+            <w:r>
+              <w:rPr>
+                <w:rFonts w:ascii="Times New Roman" w:hAnsi="Times New Roman" w:cs="Times New Roman"/>
                 <w:color w:val="595959"/>
-                <w:sz w:val="16"/>
-                <w:szCs w:val="16"/>
+                <w:sz w:val="24"/>
+                <w:szCs w:val="24"/>
               </w:rPr>
               <w:t>p = 5.27×10</w:t>
             </w:r>
             <w:r>
               <w:rPr>
-                <w:rFonts w:cs="Arial"/>
+                <w:rFonts w:ascii="Times New Roman" w:hAnsi="Times New Roman" w:cs="Times New Roman"/>
                 <w:color w:val="595959"/>
-                <w:sz w:val="16"/>
-                <w:szCs w:val="16"/>
+                <w:sz w:val="24"/>
+                <w:szCs w:val="24"/>
                 <w:vertAlign w:val="superscript"/>
               </w:rPr>
               <w:t>−30</w:t>
@@ -1625,7 +2178,7 @@
         </w:tc>
         <w:tc>
           <w:tcPr>
-            <w:tcW w:w="2000" w:type="dxa"/>
+            <w:tcW w:w="1559" w:type="dxa"/>
             <w:tcBorders>
               <w:top w:val="single" w:sz="1" w:space="0" w:color="CCCCCC"/>
               <w:left w:val="single" w:sz="1" w:space="0" w:color="CCCCCC"/>
@@ -1642,16 +2195,45 @@
             <w:vAlign w:val="center"/>
           </w:tcPr>
           <w:p>
-            <w:r>
-              <w:rPr>
-                <w:rFonts w:cs="Arial"/>
+            <w:pPr>
+              <w:rPr>
+                <w:rFonts w:ascii="Times New Roman" w:hAnsi="Times New Roman" w:cs="Times New Roman"/>
+                <w:sz w:val="24"/>
+                <w:szCs w:val="24"/>
+              </w:rPr>
+            </w:pPr>
+            <w:r>
+              <w:rPr>
+                <w:rFonts w:ascii="Times New Roman" w:hAnsi="Times New Roman" w:cs="Times New Roman"/>
                 <w:b/>
                 <w:bCs/>
                 <w:color w:val="375623"/>
-                <w:sz w:val="18"/>
-                <w:szCs w:val="18"/>
-              </w:rPr>
-              <w:t>Reject H₀ ✓ Significant</w:t>
+                <w:sz w:val="24"/>
+                <w:szCs w:val="24"/>
+              </w:rPr>
+              <w:t xml:space="preserve">Reject H₀ </w:t>
+            </w:r>
+            <w:r>
+              <w:rPr>
+                <w:rFonts w:ascii="MS Gothic" w:eastAsia="MS Gothic" w:hAnsi="MS Gothic" w:cs="MS Gothic" w:hint="eastAsia"/>
+                <w:b/>
+                <w:bCs/>
+                <w:color w:val="375623"/>
+                <w:sz w:val="24"/>
+                <w:szCs w:val="24"/>
+              </w:rPr>
+              <w:t>✓</w:t>
+            </w:r>
+            <w:r>
+              <w:rPr>
+                <w:rFonts w:ascii="Times New Roman" w:hAnsi="Times New Roman" w:cs="Times New Roman"/>
+                <w:b/>
+                <w:bCs/>
+                <w:color w:val="375623"/>
+                <w:sz w:val="24"/>
+                <w:szCs w:val="24"/>
+              </w:rPr>
+              <w:t xml:space="preserve"> Significant</w:t>
             </w:r>
           </w:p>
         </w:tc>
@@ -1659,7 +2241,7 @@
       <w:tr>
         <w:tc>
           <w:tcPr>
-            <w:tcW w:w="400" w:type="dxa"/>
+            <w:tcW w:w="575" w:type="dxa"/>
             <w:tcBorders>
               <w:top w:val="single" w:sz="1" w:space="0" w:color="CCCCCC"/>
               <w:left w:val="single" w:sz="1" w:space="0" w:color="CCCCCC"/>
@@ -1676,10 +2258,19 @@
             <w:vAlign w:val="center"/>
           </w:tcPr>
           <w:p>
-            <w:r>
-              <w:rPr>
-                <w:rFonts w:cs="Arial"/>
+            <w:pPr>
+              <w:rPr>
+                <w:rFonts w:ascii="Times New Roman" w:hAnsi="Times New Roman" w:cs="Times New Roman"/>
+                <w:sz w:val="24"/>
+                <w:szCs w:val="24"/>
+              </w:rPr>
+            </w:pPr>
+            <w:r>
+              <w:rPr>
+                <w:rFonts w:ascii="Times New Roman" w:hAnsi="Times New Roman" w:cs="Times New Roman"/>
                 <w:color w:val="000000"/>
+                <w:sz w:val="24"/>
+                <w:szCs w:val="24"/>
               </w:rPr>
               <w:t>H2</w:t>
             </w:r>
@@ -1687,7 +2278,7 @@
         </w:tc>
         <w:tc>
           <w:tcPr>
-            <w:tcW w:w="1200" w:type="dxa"/>
+            <w:tcW w:w="1562" w:type="dxa"/>
             <w:tcBorders>
               <w:top w:val="single" w:sz="1" w:space="0" w:color="CCCCCC"/>
               <w:left w:val="single" w:sz="1" w:space="0" w:color="CCCCCC"/>
@@ -1704,12 +2295,21 @@
             <w:vAlign w:val="center"/>
           </w:tcPr>
           <w:p>
-            <w:r>
-              <w:rPr>
-                <w:rFonts w:cs="Arial"/>
+            <w:pPr>
+              <w:rPr>
+                <w:rFonts w:ascii="Times New Roman" w:hAnsi="Times New Roman" w:cs="Times New Roman"/>
+                <w:sz w:val="24"/>
+                <w:szCs w:val="24"/>
+              </w:rPr>
+            </w:pPr>
+            <w:r>
+              <w:rPr>
+                <w:rFonts w:ascii="Times New Roman" w:hAnsi="Times New Roman" w:cs="Times New Roman"/>
                 <w:b/>
                 <w:bCs/>
                 <w:color w:val="000000"/>
+                <w:sz w:val="24"/>
+                <w:szCs w:val="24"/>
               </w:rPr>
               <w:t>ANOVA</w:t>
             </w:r>
@@ -1717,7 +2317,7 @@
         </w:tc>
         <w:tc>
           <w:tcPr>
-            <w:tcW w:w="2200" w:type="dxa"/>
+            <w:tcW w:w="1943" w:type="dxa"/>
             <w:tcBorders>
               <w:top w:val="single" w:sz="1" w:space="0" w:color="CCCCCC"/>
               <w:left w:val="single" w:sz="1" w:space="0" w:color="CCCCCC"/>
@@ -1734,12 +2334,19 @@
             <w:vAlign w:val="center"/>
           </w:tcPr>
           <w:p>
-            <w:r>
-              <w:rPr>
-                <w:rFonts w:cs="Arial"/>
+            <w:pPr>
+              <w:rPr>
+                <w:rFonts w:ascii="Times New Roman" w:hAnsi="Times New Roman" w:cs="Times New Roman"/>
+                <w:sz w:val="24"/>
+                <w:szCs w:val="24"/>
+              </w:rPr>
+            </w:pPr>
+            <w:r>
+              <w:rPr>
+                <w:rFonts w:ascii="Times New Roman" w:hAnsi="Times New Roman" w:cs="Times New Roman"/>
                 <w:color w:val="000000"/>
-                <w:sz w:val="18"/>
-                <w:szCs w:val="18"/>
+                <w:sz w:val="24"/>
+                <w:szCs w:val="24"/>
               </w:rPr>
               <w:t>No difference across income groups</w:t>
             </w:r>
@@ -1747,7 +2354,7 @@
         </w:tc>
         <w:tc>
           <w:tcPr>
-            <w:tcW w:w="2200" w:type="dxa"/>
+            <w:tcW w:w="2309" w:type="dxa"/>
             <w:tcBorders>
               <w:top w:val="single" w:sz="1" w:space="0" w:color="CCCCCC"/>
               <w:left w:val="single" w:sz="1" w:space="0" w:color="CCCCCC"/>
@@ -1764,12 +2371,19 @@
             <w:vAlign w:val="center"/>
           </w:tcPr>
           <w:p>
-            <w:r>
-              <w:rPr>
-                <w:rFonts w:cs="Arial"/>
+            <w:pPr>
+              <w:rPr>
+                <w:rFonts w:ascii="Times New Roman" w:hAnsi="Times New Roman" w:cs="Times New Roman"/>
+                <w:sz w:val="24"/>
+                <w:szCs w:val="24"/>
+              </w:rPr>
+            </w:pPr>
+            <w:r>
+              <w:rPr>
+                <w:rFonts w:ascii="Times New Roman" w:hAnsi="Times New Roman" w:cs="Times New Roman"/>
                 <w:color w:val="000000"/>
-                <w:sz w:val="18"/>
-                <w:szCs w:val="18"/>
+                <w:sz w:val="24"/>
+                <w:szCs w:val="24"/>
               </w:rPr>
               <w:t>At least one income group differs</w:t>
             </w:r>
@@ -1777,7 +2391,7 @@
         </w:tc>
         <w:tc>
           <w:tcPr>
-            <w:tcW w:w="1360" w:type="dxa"/>
+            <w:tcW w:w="1701" w:type="dxa"/>
             <w:tcBorders>
               <w:top w:val="single" w:sz="1" w:space="0" w:color="CCCCCC"/>
               <w:left w:val="single" w:sz="1" w:space="0" w:color="CCCCCC"/>
@@ -1793,25 +2407,39 @@
             </w:tcMar>
           </w:tcPr>
           <w:p>
-            <w:r>
-              <w:rPr>
-                <w:rFonts w:cs="Arial"/>
+            <w:pPr>
+              <w:rPr>
+                <w:rFonts w:ascii="Times New Roman" w:hAnsi="Times New Roman" w:cs="Times New Roman"/>
+                <w:sz w:val="24"/>
+                <w:szCs w:val="24"/>
+              </w:rPr>
+            </w:pPr>
+            <w:r>
+              <w:rPr>
+                <w:rFonts w:ascii="Times New Roman" w:hAnsi="Times New Roman" w:cs="Times New Roman"/>
                 <w:b/>
                 <w:bCs/>
                 <w:color w:val="1F4E79"/>
-                <w:sz w:val="18"/>
-                <w:szCs w:val="18"/>
+                <w:sz w:val="24"/>
+                <w:szCs w:val="24"/>
               </w:rPr>
               <w:t>F = 41.79</w:t>
             </w:r>
           </w:p>
           <w:p>
-            <w:r>
-              <w:rPr>
-                <w:rFonts w:cs="Arial"/>
+            <w:pPr>
+              <w:rPr>
+                <w:rFonts w:ascii="Times New Roman" w:hAnsi="Times New Roman" w:cs="Times New Roman"/>
+                <w:sz w:val="24"/>
+                <w:szCs w:val="24"/>
+              </w:rPr>
+            </w:pPr>
+            <w:r>
+              <w:rPr>
+                <w:rFonts w:ascii="Times New Roman" w:hAnsi="Times New Roman" w:cs="Times New Roman"/>
                 <w:color w:val="595959"/>
-                <w:sz w:val="16"/>
-                <w:szCs w:val="16"/>
+                <w:sz w:val="24"/>
+                <w:szCs w:val="24"/>
               </w:rPr>
               <w:t>p = 1.39×10⁻³⁶</w:t>
             </w:r>
@@ -1819,7 +2447,7 @@
         </w:tc>
         <w:tc>
           <w:tcPr>
-            <w:tcW w:w="2000" w:type="dxa"/>
+            <w:tcW w:w="1559" w:type="dxa"/>
             <w:tcBorders>
               <w:top w:val="single" w:sz="1" w:space="0" w:color="CCCCCC"/>
               <w:left w:val="single" w:sz="1" w:space="0" w:color="CCCCCC"/>
@@ -1836,16 +2464,45 @@
             <w:vAlign w:val="center"/>
           </w:tcPr>
           <w:p>
-            <w:r>
-              <w:rPr>
-                <w:rFonts w:cs="Arial"/>
+            <w:pPr>
+              <w:rPr>
+                <w:rFonts w:ascii="Times New Roman" w:hAnsi="Times New Roman" w:cs="Times New Roman"/>
+                <w:sz w:val="24"/>
+                <w:szCs w:val="24"/>
+              </w:rPr>
+            </w:pPr>
+            <w:r>
+              <w:rPr>
+                <w:rFonts w:ascii="Times New Roman" w:hAnsi="Times New Roman" w:cs="Times New Roman"/>
                 <w:b/>
                 <w:bCs/>
                 <w:color w:val="375623"/>
-                <w:sz w:val="18"/>
-                <w:szCs w:val="18"/>
-              </w:rPr>
-              <w:t>Reject H₀ ✓ Significant</w:t>
+                <w:sz w:val="24"/>
+                <w:szCs w:val="24"/>
+              </w:rPr>
+              <w:t xml:space="preserve">Reject H₀ </w:t>
+            </w:r>
+            <w:r>
+              <w:rPr>
+                <w:rFonts w:ascii="MS Gothic" w:eastAsia="MS Gothic" w:hAnsi="MS Gothic" w:cs="MS Gothic" w:hint="eastAsia"/>
+                <w:b/>
+                <w:bCs/>
+                <w:color w:val="375623"/>
+                <w:sz w:val="24"/>
+                <w:szCs w:val="24"/>
+              </w:rPr>
+              <w:t>✓</w:t>
+            </w:r>
+            <w:r>
+              <w:rPr>
+                <w:rFonts w:ascii="Times New Roman" w:hAnsi="Times New Roman" w:cs="Times New Roman"/>
+                <w:b/>
+                <w:bCs/>
+                <w:color w:val="375623"/>
+                <w:sz w:val="24"/>
+                <w:szCs w:val="24"/>
+              </w:rPr>
+              <w:t xml:space="preserve"> Significant</w:t>
             </w:r>
           </w:p>
         </w:tc>
@@ -1853,7 +2510,7 @@
       <w:tr>
         <w:tc>
           <w:tcPr>
-            <w:tcW w:w="400" w:type="dxa"/>
+            <w:tcW w:w="575" w:type="dxa"/>
             <w:tcBorders>
               <w:top w:val="single" w:sz="1" w:space="0" w:color="CCCCCC"/>
               <w:left w:val="single" w:sz="1" w:space="0" w:color="CCCCCC"/>
@@ -1870,10 +2527,19 @@
             <w:vAlign w:val="center"/>
           </w:tcPr>
           <w:p>
-            <w:r>
-              <w:rPr>
-                <w:rFonts w:cs="Arial"/>
+            <w:pPr>
+              <w:rPr>
+                <w:rFonts w:ascii="Times New Roman" w:hAnsi="Times New Roman" w:cs="Times New Roman"/>
+                <w:sz w:val="24"/>
+                <w:szCs w:val="24"/>
+              </w:rPr>
+            </w:pPr>
+            <w:r>
+              <w:rPr>
+                <w:rFonts w:ascii="Times New Roman" w:hAnsi="Times New Roman" w:cs="Times New Roman"/>
                 <w:color w:val="000000"/>
+                <w:sz w:val="24"/>
+                <w:szCs w:val="24"/>
               </w:rPr>
               <w:t>H3</w:t>
             </w:r>
@@ -1881,7 +2547,7 @@
         </w:tc>
         <w:tc>
           <w:tcPr>
-            <w:tcW w:w="1200" w:type="dxa"/>
+            <w:tcW w:w="1562" w:type="dxa"/>
             <w:tcBorders>
               <w:top w:val="single" w:sz="1" w:space="0" w:color="CCCCCC"/>
               <w:left w:val="single" w:sz="1" w:space="0" w:color="CCCCCC"/>
@@ -1898,12 +2564,21 @@
             <w:vAlign w:val="center"/>
           </w:tcPr>
           <w:p>
-            <w:r>
-              <w:rPr>
-                <w:rFonts w:cs="Arial"/>
+            <w:pPr>
+              <w:rPr>
+                <w:rFonts w:ascii="Times New Roman" w:hAnsi="Times New Roman" w:cs="Times New Roman"/>
+                <w:sz w:val="24"/>
+                <w:szCs w:val="24"/>
+              </w:rPr>
+            </w:pPr>
+            <w:r>
+              <w:rPr>
+                <w:rFonts w:ascii="Times New Roman" w:hAnsi="Times New Roman" w:cs="Times New Roman"/>
                 <w:b/>
                 <w:bCs/>
                 <w:color w:val="000000"/>
+                <w:sz w:val="24"/>
+                <w:szCs w:val="24"/>
               </w:rPr>
               <w:t>ANOVA</w:t>
             </w:r>
@@ -1911,7 +2586,7 @@
         </w:tc>
         <w:tc>
           <w:tcPr>
-            <w:tcW w:w="2200" w:type="dxa"/>
+            <w:tcW w:w="1943" w:type="dxa"/>
             <w:tcBorders>
               <w:top w:val="single" w:sz="1" w:space="0" w:color="CCCCCC"/>
               <w:left w:val="single" w:sz="1" w:space="0" w:color="CCCCCC"/>
@@ -1928,12 +2603,19 @@
             <w:vAlign w:val="center"/>
           </w:tcPr>
           <w:p>
-            <w:r>
-              <w:rPr>
-                <w:rFonts w:cs="Arial"/>
+            <w:pPr>
+              <w:rPr>
+                <w:rFonts w:ascii="Times New Roman" w:hAnsi="Times New Roman" w:cs="Times New Roman"/>
+                <w:sz w:val="24"/>
+                <w:szCs w:val="24"/>
+              </w:rPr>
+            </w:pPr>
+            <w:r>
+              <w:rPr>
+                <w:rFonts w:ascii="Times New Roman" w:hAnsi="Times New Roman" w:cs="Times New Roman"/>
                 <w:color w:val="000000"/>
-                <w:sz w:val="18"/>
-                <w:szCs w:val="18"/>
+                <w:sz w:val="24"/>
+                <w:szCs w:val="24"/>
               </w:rPr>
               <w:t>Vehicle ownership has no effect on fuel</w:t>
             </w:r>
@@ -1941,7 +2623,7 @@
         </w:tc>
         <w:tc>
           <w:tcPr>
-            <w:tcW w:w="2200" w:type="dxa"/>
+            <w:tcW w:w="2309" w:type="dxa"/>
             <w:tcBorders>
               <w:top w:val="single" w:sz="1" w:space="0" w:color="CCCCCC"/>
               <w:left w:val="single" w:sz="1" w:space="0" w:color="CCCCCC"/>
@@ -1958,12 +2640,19 @@
             <w:vAlign w:val="center"/>
           </w:tcPr>
           <w:p>
-            <w:r>
-              <w:rPr>
-                <w:rFonts w:cs="Arial"/>
+            <w:pPr>
+              <w:rPr>
+                <w:rFonts w:ascii="Times New Roman" w:hAnsi="Times New Roman" w:cs="Times New Roman"/>
+                <w:sz w:val="24"/>
+                <w:szCs w:val="24"/>
+              </w:rPr>
+            </w:pPr>
+            <w:r>
+              <w:rPr>
+                <w:rFonts w:ascii="Times New Roman" w:hAnsi="Times New Roman" w:cs="Times New Roman"/>
                 <w:color w:val="000000"/>
-                <w:sz w:val="18"/>
-                <w:szCs w:val="18"/>
+                <w:sz w:val="24"/>
+                <w:szCs w:val="24"/>
               </w:rPr>
               <w:t>Vehicle ownership significantly affects fuel</w:t>
             </w:r>
@@ -1971,7 +2660,7 @@
         </w:tc>
         <w:tc>
           <w:tcPr>
-            <w:tcW w:w="1360" w:type="dxa"/>
+            <w:tcW w:w="1701" w:type="dxa"/>
             <w:tcBorders>
               <w:top w:val="single" w:sz="1" w:space="0" w:color="CCCCCC"/>
               <w:left w:val="single" w:sz="1" w:space="0" w:color="CCCCCC"/>
@@ -1986,25 +2675,39 @@
             </w:tcMar>
           </w:tcPr>
           <w:p>
-            <w:r>
-              <w:rPr>
-                <w:rFonts w:cs="Arial"/>
+            <w:pPr>
+              <w:rPr>
+                <w:rFonts w:ascii="Times New Roman" w:hAnsi="Times New Roman" w:cs="Times New Roman"/>
+                <w:sz w:val="24"/>
+                <w:szCs w:val="24"/>
+              </w:rPr>
+            </w:pPr>
+            <w:r>
+              <w:rPr>
+                <w:rFonts w:ascii="Times New Roman" w:hAnsi="Times New Roman" w:cs="Times New Roman"/>
                 <w:b/>
                 <w:bCs/>
                 <w:color w:val="1F4E79"/>
-                <w:sz w:val="18"/>
-                <w:szCs w:val="18"/>
+                <w:sz w:val="24"/>
+                <w:szCs w:val="24"/>
               </w:rPr>
               <w:t>F = 150.81</w:t>
             </w:r>
           </w:p>
           <w:p>
-            <w:r>
-              <w:rPr>
-                <w:rFonts w:cs="Arial"/>
+            <w:pPr>
+              <w:rPr>
+                <w:rFonts w:ascii="Times New Roman" w:hAnsi="Times New Roman" w:cs="Times New Roman"/>
+                <w:sz w:val="24"/>
+                <w:szCs w:val="24"/>
+              </w:rPr>
+            </w:pPr>
+            <w:r>
+              <w:rPr>
+                <w:rFonts w:ascii="Times New Roman" w:hAnsi="Times New Roman" w:cs="Times New Roman"/>
                 <w:color w:val="595959"/>
-                <w:sz w:val="16"/>
-                <w:szCs w:val="16"/>
+                <w:sz w:val="24"/>
+                <w:szCs w:val="24"/>
               </w:rPr>
               <w:t>p = 9.98×10⁻⁷²</w:t>
             </w:r>
@@ -2012,7 +2715,7 @@
         </w:tc>
         <w:tc>
           <w:tcPr>
-            <w:tcW w:w="2000" w:type="dxa"/>
+            <w:tcW w:w="1559" w:type="dxa"/>
             <w:tcBorders>
               <w:top w:val="single" w:sz="1" w:space="0" w:color="CCCCCC"/>
               <w:left w:val="single" w:sz="1" w:space="0" w:color="CCCCCC"/>
@@ -2029,16 +2732,45 @@
             <w:vAlign w:val="center"/>
           </w:tcPr>
           <w:p>
-            <w:r>
-              <w:rPr>
-                <w:rFonts w:cs="Arial"/>
+            <w:pPr>
+              <w:rPr>
+                <w:rFonts w:ascii="Times New Roman" w:hAnsi="Times New Roman" w:cs="Times New Roman"/>
+                <w:sz w:val="24"/>
+                <w:szCs w:val="24"/>
+              </w:rPr>
+            </w:pPr>
+            <w:r>
+              <w:rPr>
+                <w:rFonts w:ascii="Times New Roman" w:hAnsi="Times New Roman" w:cs="Times New Roman"/>
                 <w:b/>
                 <w:bCs/>
                 <w:color w:val="375623"/>
-                <w:sz w:val="18"/>
-                <w:szCs w:val="18"/>
-              </w:rPr>
-              <w:t>Reject H₀ ✓ Strongest</w:t>
+                <w:sz w:val="24"/>
+                <w:szCs w:val="24"/>
+              </w:rPr>
+              <w:t xml:space="preserve">Reject H₀ </w:t>
+            </w:r>
+            <w:r>
+              <w:rPr>
+                <w:rFonts w:ascii="MS Gothic" w:eastAsia="MS Gothic" w:hAnsi="MS Gothic" w:cs="MS Gothic" w:hint="eastAsia"/>
+                <w:b/>
+                <w:bCs/>
+                <w:color w:val="375623"/>
+                <w:sz w:val="24"/>
+                <w:szCs w:val="24"/>
+              </w:rPr>
+              <w:t>✓</w:t>
+            </w:r>
+            <w:r>
+              <w:rPr>
+                <w:rFonts w:ascii="Times New Roman" w:hAnsi="Times New Roman" w:cs="Times New Roman"/>
+                <w:b/>
+                <w:bCs/>
+                <w:color w:val="375623"/>
+                <w:sz w:val="24"/>
+                <w:szCs w:val="24"/>
+              </w:rPr>
+              <w:t xml:space="preserve"> Strongest</w:t>
             </w:r>
           </w:p>
         </w:tc>
@@ -2046,7 +2778,7 @@
       <w:tr>
         <w:tc>
           <w:tcPr>
-            <w:tcW w:w="400" w:type="dxa"/>
+            <w:tcW w:w="575" w:type="dxa"/>
             <w:tcBorders>
               <w:top w:val="single" w:sz="1" w:space="0" w:color="CCCCCC"/>
               <w:left w:val="single" w:sz="1" w:space="0" w:color="CCCCCC"/>
@@ -2063,10 +2795,19 @@
             <w:vAlign w:val="center"/>
           </w:tcPr>
           <w:p>
-            <w:r>
-              <w:rPr>
-                <w:rFonts w:cs="Arial"/>
+            <w:pPr>
+              <w:rPr>
+                <w:rFonts w:ascii="Times New Roman" w:hAnsi="Times New Roman" w:cs="Times New Roman"/>
+                <w:sz w:val="24"/>
+                <w:szCs w:val="24"/>
+              </w:rPr>
+            </w:pPr>
+            <w:r>
+              <w:rPr>
+                <w:rFonts w:ascii="Times New Roman" w:hAnsi="Times New Roman" w:cs="Times New Roman"/>
                 <w:color w:val="000000"/>
+                <w:sz w:val="24"/>
+                <w:szCs w:val="24"/>
               </w:rPr>
               <w:t>H4</w:t>
             </w:r>
@@ -2074,7 +2815,7 @@
         </w:tc>
         <w:tc>
           <w:tcPr>
-            <w:tcW w:w="1200" w:type="dxa"/>
+            <w:tcW w:w="1562" w:type="dxa"/>
             <w:tcBorders>
               <w:top w:val="single" w:sz="1" w:space="0" w:color="CCCCCC"/>
               <w:left w:val="single" w:sz="1" w:space="0" w:color="CCCCCC"/>
@@ -2091,12 +2832,21 @@
             <w:vAlign w:val="center"/>
           </w:tcPr>
           <w:p>
-            <w:r>
-              <w:rPr>
-                <w:rFonts w:cs="Arial"/>
+            <w:pPr>
+              <w:rPr>
+                <w:rFonts w:ascii="Times New Roman" w:hAnsi="Times New Roman" w:cs="Times New Roman"/>
+                <w:sz w:val="24"/>
+                <w:szCs w:val="24"/>
+              </w:rPr>
+            </w:pPr>
+            <w:r>
+              <w:rPr>
+                <w:rFonts w:ascii="Times New Roman" w:hAnsi="Times New Roman" w:cs="Times New Roman"/>
                 <w:b/>
                 <w:bCs/>
                 <w:color w:val="000000"/>
+                <w:sz w:val="24"/>
+                <w:szCs w:val="24"/>
               </w:rPr>
               <w:t>Correlation</w:t>
             </w:r>
@@ -2104,7 +2854,7 @@
         </w:tc>
         <w:tc>
           <w:tcPr>
-            <w:tcW w:w="2200" w:type="dxa"/>
+            <w:tcW w:w="1943" w:type="dxa"/>
             <w:tcBorders>
               <w:top w:val="single" w:sz="1" w:space="0" w:color="CCCCCC"/>
               <w:left w:val="single" w:sz="1" w:space="0" w:color="CCCCCC"/>
@@ -2121,12 +2871,19 @@
             <w:vAlign w:val="center"/>
           </w:tcPr>
           <w:p>
-            <w:r>
-              <w:rPr>
-                <w:rFonts w:cs="Arial"/>
+            <w:pPr>
+              <w:rPr>
+                <w:rFonts w:ascii="Times New Roman" w:hAnsi="Times New Roman" w:cs="Times New Roman"/>
+                <w:sz w:val="24"/>
+                <w:szCs w:val="24"/>
+              </w:rPr>
+            </w:pPr>
+            <w:r>
+              <w:rPr>
+                <w:rFonts w:ascii="Times New Roman" w:hAnsi="Times New Roman" w:cs="Times New Roman"/>
                 <w:color w:val="000000"/>
-                <w:sz w:val="18"/>
-                <w:szCs w:val="18"/>
+                <w:sz w:val="24"/>
+                <w:szCs w:val="24"/>
               </w:rPr>
               <w:t>No correlation between income and fuel (r=0)</w:t>
             </w:r>
@@ -2134,7 +2891,7 @@
         </w:tc>
         <w:tc>
           <w:tcPr>
-            <w:tcW w:w="2200" w:type="dxa"/>
+            <w:tcW w:w="2309" w:type="dxa"/>
             <w:tcBorders>
               <w:top w:val="single" w:sz="1" w:space="0" w:color="CCCCCC"/>
               <w:left w:val="single" w:sz="1" w:space="0" w:color="CCCCCC"/>
@@ -2151,12 +2908,19 @@
             <w:vAlign w:val="center"/>
           </w:tcPr>
           <w:p>
-            <w:r>
-              <w:rPr>
-                <w:rFonts w:cs="Arial"/>
+            <w:pPr>
+              <w:rPr>
+                <w:rFonts w:ascii="Times New Roman" w:hAnsi="Times New Roman" w:cs="Times New Roman"/>
+                <w:sz w:val="24"/>
+                <w:szCs w:val="24"/>
+              </w:rPr>
+            </w:pPr>
+            <w:r>
+              <w:rPr>
+                <w:rFonts w:ascii="Times New Roman" w:hAnsi="Times New Roman" w:cs="Times New Roman"/>
                 <w:color w:val="000000"/>
-                <w:sz w:val="18"/>
-                <w:szCs w:val="18"/>
+                <w:sz w:val="24"/>
+                <w:szCs w:val="24"/>
               </w:rPr>
               <w:t>Significant positive correlation exists</w:t>
             </w:r>
@@ -2164,7 +2928,7 @@
         </w:tc>
         <w:tc>
           <w:tcPr>
-            <w:tcW w:w="1360" w:type="dxa"/>
+            <w:tcW w:w="1701" w:type="dxa"/>
             <w:tcBorders>
               <w:top w:val="single" w:sz="1" w:space="0" w:color="CCCCCC"/>
               <w:left w:val="single" w:sz="1" w:space="0" w:color="CCCCCC"/>
@@ -2180,25 +2944,39 @@
             </w:tcMar>
           </w:tcPr>
           <w:p>
-            <w:r>
-              <w:rPr>
-                <w:rFonts w:cs="Arial"/>
+            <w:pPr>
+              <w:rPr>
+                <w:rFonts w:ascii="Times New Roman" w:hAnsi="Times New Roman" w:cs="Times New Roman"/>
+                <w:sz w:val="24"/>
+                <w:szCs w:val="24"/>
+              </w:rPr>
+            </w:pPr>
+            <w:r>
+              <w:rPr>
+                <w:rFonts w:ascii="Times New Roman" w:hAnsi="Times New Roman" w:cs="Times New Roman"/>
                 <w:b/>
                 <w:bCs/>
                 <w:color w:val="1F4E79"/>
-                <w:sz w:val="18"/>
-                <w:szCs w:val="18"/>
+                <w:sz w:val="24"/>
+                <w:szCs w:val="24"/>
               </w:rPr>
               <w:t>r = 0.518</w:t>
             </w:r>
           </w:p>
           <w:p>
-            <w:r>
-              <w:rPr>
-                <w:rFonts w:cs="Arial"/>
+            <w:pPr>
+              <w:rPr>
+                <w:rFonts w:ascii="Times New Roman" w:hAnsi="Times New Roman" w:cs="Times New Roman"/>
+                <w:sz w:val="24"/>
+                <w:szCs w:val="24"/>
+              </w:rPr>
+            </w:pPr>
+            <w:r>
+              <w:rPr>
+                <w:rFonts w:ascii="Times New Roman" w:hAnsi="Times New Roman" w:cs="Times New Roman"/>
                 <w:color w:val="595959"/>
-                <w:sz w:val="16"/>
-                <w:szCs w:val="16"/>
+                <w:sz w:val="24"/>
+                <w:szCs w:val="24"/>
               </w:rPr>
               <w:t>p &lt; 0.05</w:t>
             </w:r>
@@ -2206,7 +2984,7 @@
         </w:tc>
         <w:tc>
           <w:tcPr>
-            <w:tcW w:w="2000" w:type="dxa"/>
+            <w:tcW w:w="1559" w:type="dxa"/>
             <w:tcBorders>
               <w:top w:val="single" w:sz="1" w:space="0" w:color="CCCCCC"/>
               <w:left w:val="single" w:sz="1" w:space="0" w:color="CCCCCC"/>
@@ -2223,16 +3001,45 @@
             <w:vAlign w:val="center"/>
           </w:tcPr>
           <w:p>
-            <w:r>
-              <w:rPr>
-                <w:rFonts w:cs="Arial"/>
+            <w:pPr>
+              <w:rPr>
+                <w:rFonts w:ascii="Times New Roman" w:hAnsi="Times New Roman" w:cs="Times New Roman"/>
+                <w:sz w:val="24"/>
+                <w:szCs w:val="24"/>
+              </w:rPr>
+            </w:pPr>
+            <w:r>
+              <w:rPr>
+                <w:rFonts w:ascii="Times New Roman" w:hAnsi="Times New Roman" w:cs="Times New Roman"/>
                 <w:b/>
                 <w:bCs/>
                 <w:color w:val="375623"/>
-                <w:sz w:val="18"/>
-                <w:szCs w:val="18"/>
-              </w:rPr>
-              <w:t>Reject H₀ ✓ Significant</w:t>
+                <w:sz w:val="24"/>
+                <w:szCs w:val="24"/>
+              </w:rPr>
+              <w:t xml:space="preserve">Reject H₀ </w:t>
+            </w:r>
+            <w:r>
+              <w:rPr>
+                <w:rFonts w:ascii="MS Gothic" w:eastAsia="MS Gothic" w:hAnsi="MS Gothic" w:cs="MS Gothic" w:hint="eastAsia"/>
+                <w:b/>
+                <w:bCs/>
+                <w:color w:val="375623"/>
+                <w:sz w:val="24"/>
+                <w:szCs w:val="24"/>
+              </w:rPr>
+              <w:t>✓</w:t>
+            </w:r>
+            <w:r>
+              <w:rPr>
+                <w:rFonts w:ascii="Times New Roman" w:hAnsi="Times New Roman" w:cs="Times New Roman"/>
+                <w:b/>
+                <w:bCs/>
+                <w:color w:val="375623"/>
+                <w:sz w:val="24"/>
+                <w:szCs w:val="24"/>
+              </w:rPr>
+              <w:t xml:space="preserve"> Significant</w:t>
             </w:r>
           </w:p>
         </w:tc>
@@ -2285,26 +3092,46 @@
           <w:p>
             <w:pPr>
               <w:spacing w:after="60"/>
-            </w:pPr>
-            <w:r>
-              <w:rPr>
-                <w:rFonts w:cs="Arial"/>
+              <w:rPr>
+                <w:rFonts w:ascii="Times New Roman" w:hAnsi="Times New Roman" w:cs="Times New Roman"/>
+                <w:sz w:val="24"/>
+                <w:szCs w:val="24"/>
+              </w:rPr>
+            </w:pPr>
+            <w:r>
+              <w:rPr>
+                <w:rFonts w:ascii="MS Gothic" w:eastAsia="MS Gothic" w:hAnsi="MS Gothic" w:cs="MS Gothic" w:hint="eastAsia"/>
                 <w:b/>
                 <w:bCs/>
                 <w:color w:val="375623"/>
-                <w:sz w:val="21"/>
-                <w:szCs w:val="21"/>
-              </w:rPr>
-              <w:t>★  Strongest Finding:</w:t>
-            </w:r>
-          </w:p>
-          <w:p>
-            <w:r>
-              <w:rPr>
-                <w:rFonts w:cs="Arial"/>
+                <w:sz w:val="24"/>
+                <w:szCs w:val="24"/>
+              </w:rPr>
+              <w:t>★</w:t>
+            </w:r>
+            <w:r>
+              <w:rPr>
+                <w:rFonts w:ascii="Times New Roman" w:hAnsi="Times New Roman" w:cs="Times New Roman"/>
+                <w:b/>
+                <w:bCs/>
                 <w:color w:val="375623"/>
-                <w:sz w:val="19"/>
-                <w:szCs w:val="19"/>
+                <w:sz w:val="24"/>
+                <w:szCs w:val="24"/>
+              </w:rPr>
+              <w:t xml:space="preserve">  Strongest Finding:</w:t>
+            </w:r>
+          </w:p>
+          <w:p>
+            <w:pPr>
+              <w:jc w:val="both"/>
+              <w:rPr>
+                <w:rFonts w:ascii="Times New Roman" w:hAnsi="Times New Roman" w:cs="Times New Roman"/>
+              </w:rPr>
+            </w:pPr>
+            <w:r>
+              <w:rPr>
+                <w:rFonts w:ascii="Times New Roman" w:hAnsi="Times New Roman" w:cs="Times New Roman"/>
+                <w:color w:val="375623"/>
               </w:rPr>
               <w:t>Vehicle ownership ANOVA yielded F = 150.81 and p = 9.98 × 10⁻⁷² — one of the most statistically powerful results possible. This confirms vehicle ownership as the primary driver of household fuel consumption in Phaltan, with effect size η² = 0.4456 (large effect).</w:t>
             </w:r>
@@ -2312,21 +3139,19 @@
         </w:tc>
       </w:tr>
     </w:tbl>
-    <w:p>
-      <w:pPr>
-        <w:spacing w:before="160" w:after="160"/>
-      </w:pPr>
-    </w:p>
     <w:p>
       <w:pPr>
         <w:pBdr>
           <w:bottom w:val="single" w:sz="6" w:space="1" w:color="2E75B6"/>
         </w:pBdr>
         <w:spacing w:before="280" w:after="100"/>
+        <w:rPr>
+          <w:rFonts w:ascii="Times New Roman" w:hAnsi="Times New Roman" w:cs="Times New Roman"/>
+        </w:rPr>
       </w:pPr>
       <w:r>
         <w:rPr>
-          <w:rFonts w:cs="Arial"/>
+          <w:rFonts w:ascii="Times New Roman" w:hAnsi="Times New Roman" w:cs="Times New Roman"/>
           <w:b/>
           <w:bCs/>
           <w:color w:val="1F4E79"/>
@@ -2380,9 +3205,14 @@
             <w:vAlign w:val="center"/>
           </w:tcPr>
           <w:p>
-            <w:r>
-              <w:rPr>
-                <w:rFonts w:cs="Arial"/>
+            <w:pPr>
+              <w:rPr>
+                <w:rFonts w:ascii="Times New Roman" w:hAnsi="Times New Roman" w:cs="Times New Roman"/>
+              </w:rPr>
+            </w:pPr>
+            <w:r>
+              <w:rPr>
+                <w:rFonts w:ascii="Times New Roman" w:hAnsi="Times New Roman" w:cs="Times New Roman"/>
                 <w:b/>
                 <w:bCs/>
                 <w:color w:val="FFFFFF"/>
@@ -2410,9 +3240,14 @@
             <w:vAlign w:val="center"/>
           </w:tcPr>
           <w:p>
-            <w:r>
-              <w:rPr>
-                <w:rFonts w:cs="Arial"/>
+            <w:pPr>
+              <w:rPr>
+                <w:rFonts w:ascii="Times New Roman" w:hAnsi="Times New Roman" w:cs="Times New Roman"/>
+              </w:rPr>
+            </w:pPr>
+            <w:r>
+              <w:rPr>
+                <w:rFonts w:ascii="Times New Roman" w:hAnsi="Times New Roman" w:cs="Times New Roman"/>
                 <w:b/>
                 <w:bCs/>
                 <w:color w:val="FFFFFF"/>
@@ -2440,9 +3275,14 @@
             <w:vAlign w:val="center"/>
           </w:tcPr>
           <w:p>
-            <w:r>
-              <w:rPr>
-                <w:rFonts w:cs="Arial"/>
+            <w:pPr>
+              <w:rPr>
+                <w:rFonts w:ascii="Times New Roman" w:hAnsi="Times New Roman" w:cs="Times New Roman"/>
+              </w:rPr>
+            </w:pPr>
+            <w:r>
+              <w:rPr>
+                <w:rFonts w:ascii="Times New Roman" w:hAnsi="Times New Roman" w:cs="Times New Roman"/>
                 <w:b/>
                 <w:bCs/>
                 <w:color w:val="FFFFFF"/>
@@ -2470,9 +3310,14 @@
             <w:vAlign w:val="center"/>
           </w:tcPr>
           <w:p>
-            <w:r>
-              <w:rPr>
-                <w:rFonts w:cs="Arial"/>
+            <w:pPr>
+              <w:rPr>
+                <w:rFonts w:ascii="Times New Roman" w:hAnsi="Times New Roman" w:cs="Times New Roman"/>
+              </w:rPr>
+            </w:pPr>
+            <w:r>
+              <w:rPr>
+                <w:rFonts w:ascii="Times New Roman" w:hAnsi="Times New Roman" w:cs="Times New Roman"/>
                 <w:b/>
                 <w:bCs/>
                 <w:color w:val="FFFFFF"/>
@@ -2504,10 +3349,13 @@
           <w:p>
             <w:pPr>
               <w:jc w:val="center"/>
-            </w:pPr>
-            <w:r>
-              <w:rPr>
-                <w:rFonts w:cs="Arial"/>
+              <w:rPr>
+                <w:rFonts w:ascii="Times New Roman" w:hAnsi="Times New Roman" w:cs="Times New Roman"/>
+              </w:rPr>
+            </w:pPr>
+            <w:r>
+              <w:rPr>
+                <w:rFonts w:ascii="Times New Roman" w:hAnsi="Times New Roman" w:cs="Times New Roman"/>
                 <w:b/>
                 <w:bCs/>
                 <w:color w:val="1F4E79"/>
@@ -2539,10 +3387,13 @@
           <w:p>
             <w:pPr>
               <w:jc w:val="center"/>
-            </w:pPr>
-            <w:r>
-              <w:rPr>
-                <w:rFonts w:cs="Arial"/>
+              <w:rPr>
+                <w:rFonts w:ascii="Times New Roman" w:hAnsi="Times New Roman" w:cs="Times New Roman"/>
+              </w:rPr>
+            </w:pPr>
+            <w:r>
+              <w:rPr>
+                <w:rFonts w:ascii="Times New Roman" w:hAnsi="Times New Roman" w:cs="Times New Roman"/>
                 <w:b/>
                 <w:bCs/>
                 <w:color w:val="1F4E79"/>
@@ -2574,10 +3425,13 @@
           <w:p>
             <w:pPr>
               <w:jc w:val="center"/>
-            </w:pPr>
-            <w:r>
-              <w:rPr>
-                <w:rFonts w:cs="Arial"/>
+              <w:rPr>
+                <w:rFonts w:ascii="Times New Roman" w:hAnsi="Times New Roman" w:cs="Times New Roman"/>
+              </w:rPr>
+            </w:pPr>
+            <w:r>
+              <w:rPr>
+                <w:rFonts w:ascii="Times New Roman" w:hAnsi="Times New Roman" w:cs="Times New Roman"/>
                 <w:b/>
                 <w:bCs/>
                 <w:color w:val="2E75B6"/>
@@ -2609,10 +3463,13 @@
           <w:p>
             <w:pPr>
               <w:jc w:val="center"/>
-            </w:pPr>
-            <w:r>
-              <w:rPr>
-                <w:rFonts w:cs="Arial"/>
+              <w:rPr>
+                <w:rFonts w:ascii="Times New Roman" w:hAnsi="Times New Roman" w:cs="Times New Roman"/>
+              </w:rPr>
+            </w:pPr>
+            <w:r>
+              <w:rPr>
+                <w:rFonts w:ascii="Times New Roman" w:hAnsi="Times New Roman" w:cs="Times New Roman"/>
                 <w:b/>
                 <w:bCs/>
                 <w:color w:val="375623"/>
@@ -2633,24 +3490,49 @@
     <w:p>
       <w:pPr>
         <w:spacing w:before="60" w:after="60"/>
+        <w:rPr>
+          <w:rFonts w:ascii="Times New Roman" w:hAnsi="Times New Roman" w:cs="Times New Roman"/>
+          <w:sz w:val="22"/>
+          <w:szCs w:val="22"/>
+        </w:rPr>
       </w:pPr>
+      <w:r>
+        <w:rPr>
+          <w:rFonts w:ascii="Times New Roman" w:hAnsi="Times New Roman" w:cs="Times New Roman"/>
+          <w:b/>
+          <w:bCs/>
+          <w:color w:val="1F4E79"/>
+        </w:rPr>
+        <w:t>Regression Equation</w:t>
+      </w:r>
+      <w:r>
+        <w:rPr>
+          <w:rFonts w:ascii="Times New Roman" w:hAnsi="Times New Roman" w:cs="Times New Roman"/>
+          <w:b/>
+          <w:bCs/>
+          <w:color w:val="1F4E79"/>
+          <w:sz w:val="22"/>
+          <w:szCs w:val="22"/>
+        </w:rPr>
+        <w:t>:</w:t>
+      </w:r>
       <w:r>
         <w:rPr>
           <w:rFonts w:cs="Arial"/>
           <w:b/>
           <w:bCs/>
           <w:color w:val="1F4E79"/>
-        </w:rPr>
-        <w:t xml:space="preserve">Regression Equation: </w:t>
+          <w:sz w:val="22"/>
+          <w:szCs w:val="22"/>
+        </w:rPr>
+        <w:t xml:space="preserve"> </w:t>
       </w:r>
       <w:r>
         <w:rPr>
-          <w:rFonts w:cs="Arial"/>
+          <w:rFonts w:ascii="Times New Roman" w:hAnsi="Times New Roman" w:cs="Times New Roman"/>
           <w:i/>
           <w:iCs/>
           <w:color w:val="222222"/>
-          <w:sz w:val="19"/>
-          <w:szCs w:val="19"/>
         </w:rPr>
         <w:t>Fuel Expense = −4,215 + 0.034(Income) + 2,716(Vehicles) + 375(Family) + 88(Distance)</w:t>
       </w:r>
@@ -2679,11 +3561,11 @@
         <w:tblLook w:val="0000" w:firstRow="0" w:lastRow="0" w:firstColumn="0" w:lastColumn="0" w:noHBand="0" w:noVBand="0"/>
       </w:tblPr>
       <w:tblGrid>
-        <w:gridCol w:w="2175"/>
-        <w:gridCol w:w="1593"/>
-        <w:gridCol w:w="1591"/>
-        <w:gridCol w:w="1425"/>
-        <w:gridCol w:w="2576"/>
+        <w:gridCol w:w="2200"/>
+        <w:gridCol w:w="1600"/>
+        <w:gridCol w:w="1600"/>
+        <w:gridCol w:w="1360"/>
+        <w:gridCol w:w="2600"/>
       </w:tblGrid>
       <w:tr>
         <w:tc>
@@ -2705,9 +3587,14 @@
             <w:vAlign w:val="center"/>
           </w:tcPr>
           <w:p>
-            <w:r>
-              <w:rPr>
-                <w:rFonts w:cs="Arial"/>
+            <w:pPr>
+              <w:rPr>
+                <w:rFonts w:ascii="Times New Roman" w:hAnsi="Times New Roman" w:cs="Times New Roman"/>
+              </w:rPr>
+            </w:pPr>
+            <w:r>
+              <w:rPr>
+                <w:rFonts w:ascii="Times New Roman" w:hAnsi="Times New Roman" w:cs="Times New Roman"/>
                 <w:b/>
                 <w:bCs/>
                 <w:color w:val="FFFFFF"/>
@@ -2735,9 +3622,14 @@
             <w:vAlign w:val="center"/>
           </w:tcPr>
           <w:p>
-            <w:r>
-              <w:rPr>
-                <w:rFonts w:cs="Arial"/>
+            <w:pPr>
+              <w:rPr>
+                <w:rFonts w:ascii="Times New Roman" w:hAnsi="Times New Roman" w:cs="Times New Roman"/>
+              </w:rPr>
+            </w:pPr>
+            <w:r>
+              <w:rPr>
+                <w:rFonts w:ascii="Times New Roman" w:hAnsi="Times New Roman" w:cs="Times New Roman"/>
                 <w:b/>
                 <w:bCs/>
                 <w:color w:val="FFFFFF"/>
@@ -2765,9 +3657,14 @@
             <w:vAlign w:val="center"/>
           </w:tcPr>
           <w:p>
-            <w:r>
-              <w:rPr>
-                <w:rFonts w:cs="Arial"/>
+            <w:pPr>
+              <w:rPr>
+                <w:rFonts w:ascii="Times New Roman" w:hAnsi="Times New Roman" w:cs="Times New Roman"/>
+              </w:rPr>
+            </w:pPr>
+            <w:r>
+              <w:rPr>
+                <w:rFonts w:ascii="Times New Roman" w:hAnsi="Times New Roman" w:cs="Times New Roman"/>
                 <w:b/>
                 <w:bCs/>
                 <w:color w:val="FFFFFF"/>
@@ -2795,9 +3692,14 @@
             <w:vAlign w:val="center"/>
           </w:tcPr>
           <w:p>
-            <w:r>
-              <w:rPr>
-                <w:rFonts w:cs="Arial"/>
+            <w:pPr>
+              <w:rPr>
+                <w:rFonts w:ascii="Times New Roman" w:hAnsi="Times New Roman" w:cs="Times New Roman"/>
+              </w:rPr>
+            </w:pPr>
+            <w:r>
+              <w:rPr>
+                <w:rFonts w:ascii="Times New Roman" w:hAnsi="Times New Roman" w:cs="Times New Roman"/>
                 <w:b/>
                 <w:bCs/>
                 <w:color w:val="FFFFFF"/>
@@ -2825,9 +3727,14 @@
             <w:vAlign w:val="center"/>
           </w:tcPr>
           <w:p>
-            <w:r>
-              <w:rPr>
-                <w:rFonts w:cs="Arial"/>
+            <w:pPr>
+              <w:rPr>
+                <w:rFonts w:ascii="Times New Roman" w:hAnsi="Times New Roman" w:cs="Times New Roman"/>
+              </w:rPr>
+            </w:pPr>
+            <w:r>
+              <w:rPr>
+                <w:rFonts w:ascii="Times New Roman" w:hAnsi="Times New Roman" w:cs="Times New Roman"/>
                 <w:b/>
                 <w:bCs/>
                 <w:color w:val="FFFFFF"/>
@@ -2857,9 +3764,14 @@
             <w:vAlign w:val="center"/>
           </w:tcPr>
           <w:p>
-            <w:r>
-              <w:rPr>
-                <w:rFonts w:cs="Arial"/>
+            <w:pPr>
+              <w:rPr>
+                <w:rFonts w:ascii="Times New Roman" w:hAnsi="Times New Roman" w:cs="Times New Roman"/>
+              </w:rPr>
+            </w:pPr>
+            <w:r>
+              <w:rPr>
+                <w:rFonts w:ascii="Times New Roman" w:hAnsi="Times New Roman" w:cs="Times New Roman"/>
                 <w:color w:val="000000"/>
               </w:rPr>
               <w:t>Intercept</w:t>
@@ -2885,9 +3797,14 @@
             <w:vAlign w:val="center"/>
           </w:tcPr>
           <w:p>
-            <w:r>
-              <w:rPr>
-                <w:rFonts w:cs="Arial"/>
+            <w:pPr>
+              <w:rPr>
+                <w:rFonts w:ascii="Times New Roman" w:hAnsi="Times New Roman" w:cs="Times New Roman"/>
+              </w:rPr>
+            </w:pPr>
+            <w:r>
+              <w:rPr>
+                <w:rFonts w:ascii="Times New Roman" w:hAnsi="Times New Roman" w:cs="Times New Roman"/>
                 <w:color w:val="000000"/>
                 <w:sz w:val="18"/>
                 <w:szCs w:val="18"/>
@@ -2915,9 +3832,14 @@
             <w:vAlign w:val="center"/>
           </w:tcPr>
           <w:p>
-            <w:r>
-              <w:rPr>
-                <w:rFonts w:cs="Arial"/>
+            <w:pPr>
+              <w:rPr>
+                <w:rFonts w:ascii="Times New Roman" w:hAnsi="Times New Roman" w:cs="Times New Roman"/>
+              </w:rPr>
+            </w:pPr>
+            <w:r>
+              <w:rPr>
+                <w:rFonts w:ascii="Times New Roman" w:hAnsi="Times New Roman" w:cs="Times New Roman"/>
                 <w:color w:val="000000"/>
                 <w:sz w:val="18"/>
                 <w:szCs w:val="18"/>
@@ -2947,10 +3869,13 @@
           <w:p>
             <w:pPr>
               <w:jc w:val="center"/>
-            </w:pPr>
-            <w:r>
-              <w:rPr>
-                <w:rFonts w:cs="Arial"/>
+              <w:rPr>
+                <w:rFonts w:ascii="Times New Roman" w:hAnsi="Times New Roman" w:cs="Times New Roman"/>
+              </w:rPr>
+            </w:pPr>
+            <w:r>
+              <w:rPr>
+                <w:rFonts w:ascii="Times New Roman" w:hAnsi="Times New Roman" w:cs="Times New Roman"/>
                 <w:color w:val="000000"/>
               </w:rPr>
               <w:t>—</w:t>
@@ -2976,9 +3901,14 @@
             <w:vAlign w:val="center"/>
           </w:tcPr>
           <w:p>
-            <w:r>
-              <w:rPr>
-                <w:rFonts w:cs="Arial"/>
+            <w:pPr>
+              <w:rPr>
+                <w:rFonts w:ascii="Times New Roman" w:hAnsi="Times New Roman" w:cs="Times New Roman"/>
+              </w:rPr>
+            </w:pPr>
+            <w:r>
+              <w:rPr>
+                <w:rFonts w:ascii="Times New Roman" w:hAnsi="Times New Roman" w:cs="Times New Roman"/>
                 <w:color w:val="595959"/>
                 <w:sz w:val="18"/>
                 <w:szCs w:val="18"/>
@@ -3008,9 +3938,14 @@
             <w:vAlign w:val="center"/>
           </w:tcPr>
           <w:p>
-            <w:r>
-              <w:rPr>
-                <w:rFonts w:cs="Arial"/>
+            <w:pPr>
+              <w:rPr>
+                <w:rFonts w:ascii="Times New Roman" w:hAnsi="Times New Roman" w:cs="Times New Roman"/>
+              </w:rPr>
+            </w:pPr>
+            <w:r>
+              <w:rPr>
+                <w:rFonts w:ascii="Times New Roman" w:hAnsi="Times New Roman" w:cs="Times New Roman"/>
                 <w:color w:val="000000"/>
               </w:rPr>
               <w:t>Number of Vehicles</w:t>
@@ -3036,9 +3971,14 @@
             <w:vAlign w:val="center"/>
           </w:tcPr>
           <w:p>
-            <w:r>
-              <w:rPr>
-                <w:rFonts w:cs="Arial"/>
+            <w:pPr>
+              <w:rPr>
+                <w:rFonts w:ascii="Times New Roman" w:hAnsi="Times New Roman" w:cs="Times New Roman"/>
+              </w:rPr>
+            </w:pPr>
+            <w:r>
+              <w:rPr>
+                <w:rFonts w:ascii="Times New Roman" w:hAnsi="Times New Roman" w:cs="Times New Roman"/>
                 <w:b/>
                 <w:bCs/>
                 <w:color w:val="1F4E79"/>
@@ -3066,9 +4006,14 @@
             <w:vAlign w:val="center"/>
           </w:tcPr>
           <w:p>
-            <w:r>
-              <w:rPr>
-                <w:rFonts w:cs="Arial"/>
+            <w:pPr>
+              <w:rPr>
+                <w:rFonts w:ascii="Times New Roman" w:hAnsi="Times New Roman" w:cs="Times New Roman"/>
+              </w:rPr>
+            </w:pPr>
+            <w:r>
+              <w:rPr>
+                <w:rFonts w:ascii="Times New Roman" w:hAnsi="Times New Roman" w:cs="Times New Roman"/>
                 <w:color w:val="000000"/>
                 <w:sz w:val="18"/>
                 <w:szCs w:val="18"/>
@@ -3096,14 +4041,28 @@
             <w:vAlign w:val="center"/>
           </w:tcPr>
           <w:p>
-            <w:r>
-              <w:rPr>
-                <w:rFonts w:cs="Arial"/>
+            <w:pPr>
+              <w:rPr>
+                <w:rFonts w:ascii="Times New Roman" w:hAnsi="Times New Roman" w:cs="Times New Roman"/>
+              </w:rPr>
+            </w:pPr>
+            <w:r>
+              <w:rPr>
+                <w:rFonts w:ascii="Times New Roman" w:hAnsi="Times New Roman" w:cs="Times New Roman"/>
                 <w:b/>
                 <w:bCs/>
                 <w:color w:val="375623"/>
               </w:rPr>
-              <w:t>Yes ✓</w:t>
+              <w:t xml:space="preserve">Yes </w:t>
+            </w:r>
+            <w:r>
+              <w:rPr>
+                <w:rFonts w:ascii="MS Gothic" w:eastAsia="MS Gothic" w:hAnsi="MS Gothic" w:cs="MS Gothic" w:hint="eastAsia"/>
+                <w:b/>
+                <w:bCs/>
+                <w:color w:val="375623"/>
+              </w:rPr>
+              <w:t>✓</w:t>
             </w:r>
           </w:p>
         </w:tc>
@@ -3126,9 +4085,14 @@
             <w:vAlign w:val="center"/>
           </w:tcPr>
           <w:p>
-            <w:r>
-              <w:rPr>
-                <w:rFonts w:cs="Arial"/>
+            <w:pPr>
+              <w:rPr>
+                <w:rFonts w:ascii="Times New Roman" w:hAnsi="Times New Roman" w:cs="Times New Roman"/>
+              </w:rPr>
+            </w:pPr>
+            <w:r>
+              <w:rPr>
+                <w:rFonts w:ascii="Times New Roman" w:hAnsi="Times New Roman" w:cs="Times New Roman"/>
                 <w:color w:val="7F6000"/>
                 <w:sz w:val="18"/>
                 <w:szCs w:val="18"/>
@@ -3158,9 +4122,14 @@
             <w:vAlign w:val="center"/>
           </w:tcPr>
           <w:p>
-            <w:r>
-              <w:rPr>
-                <w:rFonts w:cs="Arial"/>
+            <w:pPr>
+              <w:rPr>
+                <w:rFonts w:ascii="Times New Roman" w:hAnsi="Times New Roman" w:cs="Times New Roman"/>
+              </w:rPr>
+            </w:pPr>
+            <w:r>
+              <w:rPr>
+                <w:rFonts w:ascii="Times New Roman" w:hAnsi="Times New Roman" w:cs="Times New Roman"/>
                 <w:color w:val="000000"/>
               </w:rPr>
               <w:t>Monthly Income</w:t>
@@ -3186,9 +4155,14 @@
             <w:vAlign w:val="center"/>
           </w:tcPr>
           <w:p>
-            <w:r>
-              <w:rPr>
-                <w:rFonts w:cs="Arial"/>
+            <w:pPr>
+              <w:rPr>
+                <w:rFonts w:ascii="Times New Roman" w:hAnsi="Times New Roman" w:cs="Times New Roman"/>
+              </w:rPr>
+            </w:pPr>
+            <w:r>
+              <w:rPr>
+                <w:rFonts w:ascii="Times New Roman" w:hAnsi="Times New Roman" w:cs="Times New Roman"/>
                 <w:b/>
                 <w:bCs/>
                 <w:color w:val="1F4E79"/>
@@ -3216,9 +4190,14 @@
             <w:vAlign w:val="center"/>
           </w:tcPr>
           <w:p>
-            <w:r>
-              <w:rPr>
-                <w:rFonts w:cs="Arial"/>
+            <w:pPr>
+              <w:rPr>
+                <w:rFonts w:ascii="Times New Roman" w:hAnsi="Times New Roman" w:cs="Times New Roman"/>
+              </w:rPr>
+            </w:pPr>
+            <w:r>
+              <w:rPr>
+                <w:rFonts w:ascii="Times New Roman" w:hAnsi="Times New Roman" w:cs="Times New Roman"/>
                 <w:color w:val="000000"/>
                 <w:sz w:val="18"/>
                 <w:szCs w:val="18"/>
@@ -3246,14 +4225,28 @@
             <w:vAlign w:val="center"/>
           </w:tcPr>
           <w:p>
-            <w:r>
-              <w:rPr>
-                <w:rFonts w:cs="Arial"/>
+            <w:pPr>
+              <w:rPr>
+                <w:rFonts w:ascii="Times New Roman" w:hAnsi="Times New Roman" w:cs="Times New Roman"/>
+              </w:rPr>
+            </w:pPr>
+            <w:r>
+              <w:rPr>
+                <w:rFonts w:ascii="Times New Roman" w:hAnsi="Times New Roman" w:cs="Times New Roman"/>
                 <w:b/>
                 <w:bCs/>
                 <w:color w:val="375623"/>
               </w:rPr>
-              <w:t>Yes ✓</w:t>
+              <w:t xml:space="preserve">Yes </w:t>
+            </w:r>
+            <w:r>
+              <w:rPr>
+                <w:rFonts w:ascii="MS Gothic" w:eastAsia="MS Gothic" w:hAnsi="MS Gothic" w:cs="MS Gothic" w:hint="eastAsia"/>
+                <w:b/>
+                <w:bCs/>
+                <w:color w:val="375623"/>
+              </w:rPr>
+              <w:t>✓</w:t>
             </w:r>
           </w:p>
         </w:tc>
@@ -3276,9 +4269,14 @@
             <w:vAlign w:val="center"/>
           </w:tcPr>
           <w:p>
-            <w:r>
-              <w:rPr>
-                <w:rFonts w:cs="Arial"/>
+            <w:pPr>
+              <w:rPr>
+                <w:rFonts w:ascii="Times New Roman" w:hAnsi="Times New Roman" w:cs="Times New Roman"/>
+              </w:rPr>
+            </w:pPr>
+            <w:r>
+              <w:rPr>
+                <w:rFonts w:ascii="Times New Roman" w:hAnsi="Times New Roman" w:cs="Times New Roman"/>
                 <w:color w:val="595959"/>
                 <w:sz w:val="18"/>
                 <w:szCs w:val="18"/>
@@ -3308,9 +4306,14 @@
             <w:vAlign w:val="center"/>
           </w:tcPr>
           <w:p>
-            <w:r>
-              <w:rPr>
-                <w:rFonts w:cs="Arial"/>
+            <w:pPr>
+              <w:rPr>
+                <w:rFonts w:ascii="Times New Roman" w:hAnsi="Times New Roman" w:cs="Times New Roman"/>
+              </w:rPr>
+            </w:pPr>
+            <w:r>
+              <w:rPr>
+                <w:rFonts w:ascii="Times New Roman" w:hAnsi="Times New Roman" w:cs="Times New Roman"/>
                 <w:color w:val="000000"/>
               </w:rPr>
               <w:t>Family Members</w:t>
@@ -3336,9 +4339,14 @@
             <w:vAlign w:val="center"/>
           </w:tcPr>
           <w:p>
-            <w:r>
-              <w:rPr>
-                <w:rFonts w:cs="Arial"/>
+            <w:pPr>
+              <w:rPr>
+                <w:rFonts w:ascii="Times New Roman" w:hAnsi="Times New Roman" w:cs="Times New Roman"/>
+              </w:rPr>
+            </w:pPr>
+            <w:r>
+              <w:rPr>
+                <w:rFonts w:ascii="Times New Roman" w:hAnsi="Times New Roman" w:cs="Times New Roman"/>
                 <w:b/>
                 <w:bCs/>
                 <w:color w:val="1F4E79"/>
@@ -3366,9 +4374,14 @@
             <w:vAlign w:val="center"/>
           </w:tcPr>
           <w:p>
-            <w:r>
-              <w:rPr>
-                <w:rFonts w:cs="Arial"/>
+            <w:pPr>
+              <w:rPr>
+                <w:rFonts w:ascii="Times New Roman" w:hAnsi="Times New Roman" w:cs="Times New Roman"/>
+              </w:rPr>
+            </w:pPr>
+            <w:r>
+              <w:rPr>
+                <w:rFonts w:ascii="Times New Roman" w:hAnsi="Times New Roman" w:cs="Times New Roman"/>
                 <w:color w:val="000000"/>
                 <w:sz w:val="18"/>
                 <w:szCs w:val="18"/>
@@ -3396,14 +4409,28 @@
             <w:vAlign w:val="center"/>
           </w:tcPr>
           <w:p>
-            <w:r>
-              <w:rPr>
-                <w:rFonts w:cs="Arial"/>
+            <w:pPr>
+              <w:rPr>
+                <w:rFonts w:ascii="Times New Roman" w:hAnsi="Times New Roman" w:cs="Times New Roman"/>
+              </w:rPr>
+            </w:pPr>
+            <w:r>
+              <w:rPr>
+                <w:rFonts w:ascii="Times New Roman" w:hAnsi="Times New Roman" w:cs="Times New Roman"/>
                 <w:b/>
                 <w:bCs/>
                 <w:color w:val="375623"/>
               </w:rPr>
-              <w:t>Yes ✓</w:t>
+              <w:t xml:space="preserve">Yes </w:t>
+            </w:r>
+            <w:r>
+              <w:rPr>
+                <w:rFonts w:ascii="MS Gothic" w:eastAsia="MS Gothic" w:hAnsi="MS Gothic" w:cs="MS Gothic" w:hint="eastAsia"/>
+                <w:b/>
+                <w:bCs/>
+                <w:color w:val="375623"/>
+              </w:rPr>
+              <w:t>✓</w:t>
             </w:r>
           </w:p>
         </w:tc>
@@ -3426,9 +4453,14 @@
             <w:vAlign w:val="center"/>
           </w:tcPr>
           <w:p>
-            <w:r>
-              <w:rPr>
-                <w:rFonts w:cs="Arial"/>
+            <w:pPr>
+              <w:rPr>
+                <w:rFonts w:ascii="Times New Roman" w:hAnsi="Times New Roman" w:cs="Times New Roman"/>
+              </w:rPr>
+            </w:pPr>
+            <w:r>
+              <w:rPr>
+                <w:rFonts w:ascii="Times New Roman" w:hAnsi="Times New Roman" w:cs="Times New Roman"/>
                 <w:color w:val="595959"/>
                 <w:sz w:val="18"/>
                 <w:szCs w:val="18"/>
@@ -3458,9 +4490,14 @@
             <w:vAlign w:val="center"/>
           </w:tcPr>
           <w:p>
-            <w:r>
-              <w:rPr>
-                <w:rFonts w:cs="Arial"/>
+            <w:pPr>
+              <w:rPr>
+                <w:rFonts w:ascii="Times New Roman" w:hAnsi="Times New Roman" w:cs="Times New Roman"/>
+              </w:rPr>
+            </w:pPr>
+            <w:r>
+              <w:rPr>
+                <w:rFonts w:ascii="Times New Roman" w:hAnsi="Times New Roman" w:cs="Times New Roman"/>
                 <w:color w:val="000000"/>
               </w:rPr>
               <w:t>Home-Work Distance</w:t>
@@ -3486,9 +4523,14 @@
             <w:vAlign w:val="center"/>
           </w:tcPr>
           <w:p>
-            <w:r>
-              <w:rPr>
-                <w:rFonts w:cs="Arial"/>
+            <w:pPr>
+              <w:rPr>
+                <w:rFonts w:ascii="Times New Roman" w:hAnsi="Times New Roman" w:cs="Times New Roman"/>
+              </w:rPr>
+            </w:pPr>
+            <w:r>
+              <w:rPr>
+                <w:rFonts w:ascii="Times New Roman" w:hAnsi="Times New Roman" w:cs="Times New Roman"/>
                 <w:b/>
                 <w:bCs/>
                 <w:color w:val="1F4E79"/>
@@ -3516,9 +4558,14 @@
             <w:vAlign w:val="center"/>
           </w:tcPr>
           <w:p>
-            <w:r>
-              <w:rPr>
-                <w:rFonts w:cs="Arial"/>
+            <w:pPr>
+              <w:rPr>
+                <w:rFonts w:ascii="Times New Roman" w:hAnsi="Times New Roman" w:cs="Times New Roman"/>
+              </w:rPr>
+            </w:pPr>
+            <w:r>
+              <w:rPr>
+                <w:rFonts w:ascii="Times New Roman" w:hAnsi="Times New Roman" w:cs="Times New Roman"/>
                 <w:color w:val="000000"/>
                 <w:sz w:val="18"/>
                 <w:szCs w:val="18"/>
@@ -3546,14 +4593,28 @@
             <w:vAlign w:val="center"/>
           </w:tcPr>
           <w:p>
-            <w:r>
-              <w:rPr>
-                <w:rFonts w:cs="Arial"/>
+            <w:pPr>
+              <w:rPr>
+                <w:rFonts w:ascii="Times New Roman" w:hAnsi="Times New Roman" w:cs="Times New Roman"/>
+              </w:rPr>
+            </w:pPr>
+            <w:r>
+              <w:rPr>
+                <w:rFonts w:ascii="Times New Roman" w:hAnsi="Times New Roman" w:cs="Times New Roman"/>
                 <w:b/>
                 <w:bCs/>
                 <w:color w:val="375623"/>
               </w:rPr>
-              <w:t>Yes ✓</w:t>
+              <w:t xml:space="preserve">Yes </w:t>
+            </w:r>
+            <w:r>
+              <w:rPr>
+                <w:rFonts w:ascii="MS Gothic" w:eastAsia="MS Gothic" w:hAnsi="MS Gothic" w:cs="MS Gothic" w:hint="eastAsia"/>
+                <w:b/>
+                <w:bCs/>
+                <w:color w:val="375623"/>
+              </w:rPr>
+              <w:t>✓</w:t>
             </w:r>
           </w:p>
         </w:tc>
@@ -3576,9 +4637,14 @@
             <w:vAlign w:val="center"/>
           </w:tcPr>
           <w:p>
-            <w:r>
-              <w:rPr>
-                <w:rFonts w:cs="Arial"/>
+            <w:pPr>
+              <w:rPr>
+                <w:rFonts w:ascii="Times New Roman" w:hAnsi="Times New Roman" w:cs="Times New Roman"/>
+              </w:rPr>
+            </w:pPr>
+            <w:r>
+              <w:rPr>
+                <w:rFonts w:ascii="Times New Roman" w:hAnsi="Times New Roman" w:cs="Times New Roman"/>
                 <w:color w:val="595959"/>
                 <w:sz w:val="18"/>
                 <w:szCs w:val="18"/>
@@ -3592,17 +4658,27 @@
     <w:p>
       <w:pPr>
         <w:spacing w:before="80" w:after="80"/>
+        <w:rPr>
+          <w:rFonts w:ascii="Times New Roman" w:hAnsi="Times New Roman" w:cs="Times New Roman"/>
+        </w:rPr>
       </w:pPr>
     </w:p>
     <w:p>
       <w:pPr>
         <w:spacing w:before="60" w:after="60"/>
         <w:jc w:val="both"/>
+        <w:rPr>
+          <w:rFonts w:ascii="Times New Roman" w:hAnsi="Times New Roman" w:cs="Times New Roman"/>
+          <w:sz w:val="24"/>
+          <w:szCs w:val="24"/>
+        </w:rPr>
       </w:pPr>
       <w:r>
         <w:rPr>
-          <w:rFonts w:cs="Arial"/>
+          <w:rFonts w:ascii="Times New Roman" w:hAnsi="Times New Roman" w:cs="Times New Roman"/>
           <w:color w:val="222222"/>
+          <w:sz w:val="24"/>
+          <w:szCs w:val="24"/>
         </w:rPr>
         <w:t>The model explains 51.76% of the variation in monthly fuel expenditure — nearly double the explanatory power of income alone (R² = 0.268 from simple regression). All four variables are statistically significant predictors at α = 0.05.</w:t>
       </w:r>
@@ -3619,25 +4695,12 @@
         </w:pBdr>
         <w:spacing w:before="280" w:after="100"/>
         <w:rPr>
-          <w:rFonts w:cs="Arial"/>
-          <w:b/>
-          <w:bCs/>
-          <w:color w:val="1F4E79"/>
-          <w:sz w:val="28"/>
-          <w:szCs w:val="28"/>
-        </w:rPr>
-      </w:pPr>
-    </w:p>
-    <w:p>
-      <w:pPr>
-        <w:pBdr>
-          <w:bottom w:val="single" w:sz="6" w:space="1" w:color="2E75B6"/>
-        </w:pBdr>
-        <w:spacing w:before="280" w:after="100"/>
+          <w:rFonts w:ascii="Times New Roman" w:hAnsi="Times New Roman" w:cs="Times New Roman"/>
+        </w:rPr>
       </w:pPr>
       <w:r>
         <w:rPr>
-          <w:rFonts w:cs="Arial"/>
+          <w:rFonts w:ascii="Times New Roman" w:hAnsi="Times New Roman" w:cs="Times New Roman"/>
           <w:b/>
           <w:bCs/>
           <w:color w:val="1F4E79"/>
@@ -3650,11 +4713,19 @@
     <w:p>
       <w:pPr>
         <w:spacing w:before="60" w:after="60"/>
+        <w:jc w:val="both"/>
+        <w:rPr>
+          <w:rFonts w:ascii="Times New Roman" w:hAnsi="Times New Roman" w:cs="Times New Roman"/>
+          <w:sz w:val="24"/>
+          <w:szCs w:val="24"/>
+        </w:rPr>
       </w:pPr>
       <w:r>
         <w:rPr>
-          <w:rFonts w:cs="Arial"/>
+          <w:rFonts w:ascii="Times New Roman" w:hAnsi="Times New Roman" w:cs="Times New Roman"/>
           <w:color w:val="222222"/>
+          <w:sz w:val="24"/>
+          <w:szCs w:val="24"/>
         </w:rPr>
         <w:t>The following recommendations are directly derived from the statistical findings of this study:</w:t>
       </w:r>
@@ -3662,6 +4733,10 @@
     <w:p>
       <w:pPr>
         <w:spacing w:before="60" w:after="60"/>
+        <w:jc w:val="both"/>
+        <w:rPr>
+          <w:rFonts w:ascii="Times New Roman" w:hAnsi="Times New Roman" w:cs="Times New Roman"/>
+        </w:rPr>
       </w:pPr>
     </w:p>
     <w:p>
@@ -3672,18 +4747,30 @@
           <w:numId w:val="2"/>
         </w:numPr>
         <w:spacing w:before="40" w:after="40"/>
+        <w:jc w:val="both"/>
+        <w:rPr>
+          <w:rFonts w:ascii="Times New Roman" w:hAnsi="Times New Roman" w:cs="Times New Roman"/>
+          <w:sz w:val="22"/>
+          <w:szCs w:val="22"/>
+        </w:rPr>
       </w:pPr>
       <w:r>
         <w:rPr>
+          <w:rFonts w:ascii="Times New Roman" w:hAnsi="Times New Roman" w:cs="Times New Roman"/>
           <w:b/>
           <w:bCs/>
           <w:color w:val="1F4E79"/>
+          <w:sz w:val="22"/>
+          <w:szCs w:val="22"/>
         </w:rPr>
         <w:t xml:space="preserve">Promote Electric 2-Wheelers: </w:t>
       </w:r>
       <w:r>
         <w:rPr>
+          <w:rFonts w:ascii="Times New Roman" w:hAnsi="Times New Roman" w:cs="Times New Roman"/>
           <w:color w:val="222222"/>
+          <w:sz w:val="22"/>
+          <w:szCs w:val="22"/>
         </w:rPr>
         <w:t>Target students and agricultural workers — the two largest occupational groups. Bike owners represent the highest frequency of vehicle ownership. EV subsidies for this segment would have the greatest reach.</w:t>
       </w:r>
@@ -3696,18 +4783,30 @@
           <w:numId w:val="2"/>
         </w:numPr>
         <w:spacing w:before="40" w:after="40"/>
+        <w:jc w:val="both"/>
+        <w:rPr>
+          <w:rFonts w:ascii="Times New Roman" w:hAnsi="Times New Roman" w:cs="Times New Roman"/>
+          <w:sz w:val="22"/>
+          <w:szCs w:val="22"/>
+        </w:rPr>
       </w:pPr>
       <w:r>
         <w:rPr>
+          <w:rFonts w:ascii="Times New Roman" w:hAnsi="Times New Roman" w:cs="Times New Roman"/>
           <w:b/>
           <w:bCs/>
           <w:color w:val="1F4E79"/>
+          <w:sz w:val="22"/>
+          <w:szCs w:val="22"/>
         </w:rPr>
         <w:t xml:space="preserve">Vehicle Sharing Schemes: </w:t>
       </w:r>
       <w:r>
         <w:rPr>
+          <w:rFonts w:ascii="Times New Roman" w:hAnsi="Times New Roman" w:cs="Times New Roman"/>
           <w:color w:val="222222"/>
+          <w:sz w:val="22"/>
+          <w:szCs w:val="22"/>
         </w:rPr>
         <w:t>With each additional vehicle adding ₹2,716/month to fuel costs, reducing multi-vehicle households through shared transport schemes would directly lower fuel consumption.</w:t>
       </w:r>
@@ -3720,18 +4819,30 @@
           <w:numId w:val="2"/>
         </w:numPr>
         <w:spacing w:before="40" w:after="40"/>
+        <w:jc w:val="both"/>
+        <w:rPr>
+          <w:rFonts w:ascii="Times New Roman" w:hAnsi="Times New Roman" w:cs="Times New Roman"/>
+          <w:sz w:val="22"/>
+          <w:szCs w:val="22"/>
+        </w:rPr>
       </w:pPr>
       <w:r>
         <w:rPr>
+          <w:rFonts w:ascii="Times New Roman" w:hAnsi="Times New Roman" w:cs="Times New Roman"/>
           <w:b/>
           <w:bCs/>
           <w:color w:val="1F4E79"/>
+          <w:sz w:val="22"/>
+          <w:szCs w:val="22"/>
         </w:rPr>
         <w:t xml:space="preserve">Improve Public Transport Connectivity: </w:t>
       </w:r>
       <w:r>
         <w:rPr>
+          <w:rFonts w:ascii="Times New Roman" w:hAnsi="Times New Roman" w:cs="Times New Roman"/>
           <w:color w:val="222222"/>
+          <w:sz w:val="22"/>
+          <w:szCs w:val="22"/>
         </w:rPr>
         <w:t>Home-to-work distance (β = ₹88/km) is a significant predictor. Improving bus and auto routes on high-commute corridors would reduce personal vehicle dependency.</w:t>
       </w:r>
@@ -3744,18 +4855,30 @@
           <w:numId w:val="2"/>
         </w:numPr>
         <w:spacing w:before="40" w:after="40"/>
+        <w:jc w:val="both"/>
+        <w:rPr>
+          <w:rFonts w:ascii="Times New Roman" w:hAnsi="Times New Roman" w:cs="Times New Roman"/>
+          <w:sz w:val="22"/>
+          <w:szCs w:val="22"/>
+        </w:rPr>
       </w:pPr>
       <w:r>
         <w:rPr>
+          <w:rFonts w:ascii="Times New Roman" w:hAnsi="Times New Roman" w:cs="Times New Roman"/>
           <w:b/>
           <w:bCs/>
           <w:color w:val="1F4E79"/>
+          <w:sz w:val="22"/>
+          <w:szCs w:val="22"/>
         </w:rPr>
         <w:t xml:space="preserve">EV Charging Infrastructure: </w:t>
       </w:r>
       <w:r>
         <w:rPr>
+          <w:rFonts w:ascii="Times New Roman" w:hAnsi="Times New Roman" w:cs="Times New Roman"/>
           <w:color w:val="222222"/>
+          <w:sz w:val="22"/>
+          <w:szCs w:val="22"/>
         </w:rPr>
         <w:t>Establish EV charging points across Phaltan to support transition to electric vehicles, especially for the households currently open to buying an EV.</w:t>
       </w:r>
@@ -3768,18 +4891,30 @@
           <w:numId w:val="2"/>
         </w:numPr>
         <w:spacing w:before="40" w:after="40"/>
+        <w:jc w:val="both"/>
+        <w:rPr>
+          <w:rFonts w:ascii="Times New Roman" w:hAnsi="Times New Roman" w:cs="Times New Roman"/>
+          <w:sz w:val="22"/>
+          <w:szCs w:val="22"/>
+        </w:rPr>
       </w:pPr>
       <w:r>
         <w:rPr>
+          <w:rFonts w:ascii="Times New Roman" w:hAnsi="Times New Roman" w:cs="Times New Roman"/>
           <w:b/>
           <w:bCs/>
           <w:color w:val="1F4E79"/>
+          <w:sz w:val="22"/>
+          <w:szCs w:val="22"/>
         </w:rPr>
         <w:t xml:space="preserve">Income-Tiered Transport Policy: </w:t>
       </w:r>
       <w:r>
         <w:rPr>
+          <w:rFonts w:ascii="Times New Roman" w:hAnsi="Times New Roman" w:cs="Times New Roman"/>
           <w:color w:val="222222"/>
+          <w:sz w:val="22"/>
+          <w:szCs w:val="22"/>
         </w:rPr>
         <w:t>High-income households (above ₹1 lakh) spend 7.6× more per capita than lowest income group. Tiered fuel pricing or congestion fees could fund public transport subsidies.</w:t>
       </w:r>
@@ -3787,6 +4922,10 @@
     <w:p>
       <w:pPr>
         <w:spacing w:before="160" w:after="160"/>
+        <w:rPr>
+          <w:sz w:val="22"/>
+          <w:szCs w:val="22"/>
+        </w:rPr>
       </w:pPr>
     </w:p>
     <w:p>
@@ -3795,10 +4934,13 @@
           <w:bottom w:val="single" w:sz="6" w:space="1" w:color="2E75B6"/>
         </w:pBdr>
         <w:spacing w:before="280" w:after="100"/>
+        <w:rPr>
+          <w:rFonts w:ascii="Times New Roman" w:hAnsi="Times New Roman" w:cs="Times New Roman"/>
+        </w:rPr>
       </w:pPr>
       <w:r>
         <w:rPr>
-          <w:rFonts w:cs="Arial"/>
+          <w:rFonts w:ascii="Times New Roman" w:hAnsi="Times New Roman" w:cs="Times New Roman"/>
           <w:b/>
           <w:bCs/>
           <w:color w:val="1F4E79"/>
@@ -3810,7 +4952,7 @@
     </w:p>
     <w:tbl>
       <w:tblPr>
-        <w:tblW w:w="9360" w:type="dxa"/>
+        <w:tblW w:w="9649" w:type="dxa"/>
         <w:tblInd w:w="150" w:type="dxa"/>
         <w:tblBorders>
           <w:top w:val="single" w:sz="4" w:space="0" w:color="auto"/>
@@ -3827,14 +4969,14 @@
         <w:tblLook w:val="0000" w:firstRow="0" w:lastRow="0" w:firstColumn="0" w:lastColumn="0" w:noHBand="0" w:noVBand="0"/>
       </w:tblPr>
       <w:tblGrid>
-        <w:gridCol w:w="3120"/>
-        <w:gridCol w:w="3120"/>
-        <w:gridCol w:w="3120"/>
+        <w:gridCol w:w="3412"/>
+        <w:gridCol w:w="3261"/>
+        <w:gridCol w:w="2976"/>
       </w:tblGrid>
       <w:tr>
         <w:tc>
           <w:tcPr>
-            <w:tcW w:w="3120" w:type="dxa"/>
+            <w:tcW w:w="3412" w:type="dxa"/>
             <w:tcBorders>
               <w:top w:val="single" w:sz="1" w:space="0" w:color="CCCCCC"/>
               <w:left w:val="single" w:sz="1" w:space="0" w:color="CCCCCC"/>
@@ -3851,12 +4993,21 @@
             <w:vAlign w:val="center"/>
           </w:tcPr>
           <w:p>
-            <w:r>
-              <w:rPr>
-                <w:rFonts w:cs="Arial"/>
+            <w:pPr>
+              <w:rPr>
+                <w:rFonts w:ascii="Times New Roman" w:hAnsi="Times New Roman" w:cs="Times New Roman"/>
+                <w:sz w:val="24"/>
+                <w:szCs w:val="24"/>
+              </w:rPr>
+            </w:pPr>
+            <w:r>
+              <w:rPr>
+                <w:rFonts w:ascii="Times New Roman" w:hAnsi="Times New Roman" w:cs="Times New Roman"/>
                 <w:b/>
                 <w:bCs/>
                 <w:color w:val="FFFFFF"/>
+                <w:sz w:val="24"/>
+                <w:szCs w:val="24"/>
               </w:rPr>
               <w:t>Statistical Skills</w:t>
             </w:r>
@@ -3864,7 +5015,7 @@
         </w:tc>
         <w:tc>
           <w:tcPr>
-            <w:tcW w:w="3120" w:type="dxa"/>
+            <w:tcW w:w="3261" w:type="dxa"/>
             <w:tcBorders>
               <w:top w:val="single" w:sz="1" w:space="0" w:color="CCCCCC"/>
               <w:left w:val="single" w:sz="1" w:space="0" w:color="CCCCCC"/>
@@ -3881,12 +5032,21 @@
             <w:vAlign w:val="center"/>
           </w:tcPr>
           <w:p>
-            <w:r>
-              <w:rPr>
-                <w:rFonts w:cs="Arial"/>
+            <w:pPr>
+              <w:rPr>
+                <w:rFonts w:ascii="Times New Roman" w:hAnsi="Times New Roman" w:cs="Times New Roman"/>
+                <w:sz w:val="24"/>
+                <w:szCs w:val="24"/>
+              </w:rPr>
+            </w:pPr>
+            <w:r>
+              <w:rPr>
+                <w:rFonts w:ascii="Times New Roman" w:hAnsi="Times New Roman" w:cs="Times New Roman"/>
                 <w:b/>
                 <w:bCs/>
                 <w:color w:val="FFFFFF"/>
+                <w:sz w:val="24"/>
+                <w:szCs w:val="24"/>
               </w:rPr>
               <w:t>Excel Skills</w:t>
             </w:r>
@@ -3894,7 +5054,7 @@
         </w:tc>
         <w:tc>
           <w:tcPr>
-            <w:tcW w:w="3120" w:type="dxa"/>
+            <w:tcW w:w="2976" w:type="dxa"/>
             <w:tcBorders>
               <w:top w:val="single" w:sz="1" w:space="0" w:color="CCCCCC"/>
               <w:left w:val="single" w:sz="1" w:space="0" w:color="CCCCCC"/>
@@ -3911,12 +5071,21 @@
             <w:vAlign w:val="center"/>
           </w:tcPr>
           <w:p>
-            <w:r>
-              <w:rPr>
-                <w:rFonts w:cs="Arial"/>
+            <w:pPr>
+              <w:rPr>
+                <w:rFonts w:ascii="Times New Roman" w:hAnsi="Times New Roman" w:cs="Times New Roman"/>
+                <w:sz w:val="24"/>
+                <w:szCs w:val="24"/>
+              </w:rPr>
+            </w:pPr>
+            <w:r>
+              <w:rPr>
+                <w:rFonts w:ascii="Times New Roman" w:hAnsi="Times New Roman" w:cs="Times New Roman"/>
                 <w:b/>
                 <w:bCs/>
                 <w:color w:val="FFFFFF"/>
+                <w:sz w:val="24"/>
+                <w:szCs w:val="24"/>
               </w:rPr>
               <w:t>Analytical Skills</w:t>
             </w:r>
@@ -3926,7 +5095,7 @@
       <w:tr>
         <w:tc>
           <w:tcPr>
-            <w:tcW w:w="3120" w:type="dxa"/>
+            <w:tcW w:w="3412" w:type="dxa"/>
             <w:tcBorders>
               <w:top w:val="single" w:sz="1" w:space="0" w:color="CCCCCC"/>
               <w:left w:val="single" w:sz="1" w:space="0" w:color="CCCCCC"/>
@@ -3948,11 +5117,17 @@
                 <w:numId w:val="2"/>
               </w:numPr>
               <w:spacing w:before="30" w:after="30"/>
-            </w:pPr>
-            <w:r>
-              <w:rPr>
-                <w:sz w:val="18"/>
-                <w:szCs w:val="18"/>
+              <w:rPr>
+                <w:rFonts w:ascii="Times New Roman" w:hAnsi="Times New Roman" w:cs="Times New Roman"/>
+                <w:sz w:val="24"/>
+                <w:szCs w:val="24"/>
+              </w:rPr>
+            </w:pPr>
+            <w:r>
+              <w:rPr>
+                <w:rFonts w:ascii="Times New Roman" w:hAnsi="Times New Roman" w:cs="Times New Roman"/>
+                <w:sz w:val="24"/>
+                <w:szCs w:val="24"/>
               </w:rPr>
               <w:t>Descriptive Statistics</w:t>
             </w:r>
@@ -3965,11 +5140,17 @@
                 <w:numId w:val="2"/>
               </w:numPr>
               <w:spacing w:before="30" w:after="30"/>
-            </w:pPr>
-            <w:r>
-              <w:rPr>
-                <w:sz w:val="18"/>
-                <w:szCs w:val="18"/>
+              <w:rPr>
+                <w:rFonts w:ascii="Times New Roman" w:hAnsi="Times New Roman" w:cs="Times New Roman"/>
+                <w:sz w:val="24"/>
+                <w:szCs w:val="24"/>
+              </w:rPr>
+            </w:pPr>
+            <w:r>
+              <w:rPr>
+                <w:rFonts w:ascii="Times New Roman" w:hAnsi="Times New Roman" w:cs="Times New Roman"/>
+                <w:sz w:val="24"/>
+                <w:szCs w:val="24"/>
               </w:rPr>
               <w:t>Hypothesis Testing (T-test)</w:t>
             </w:r>
@@ -3982,11 +5163,17 @@
                 <w:numId w:val="2"/>
               </w:numPr>
               <w:spacing w:before="30" w:after="30"/>
-            </w:pPr>
-            <w:r>
-              <w:rPr>
-                <w:sz w:val="18"/>
-                <w:szCs w:val="18"/>
+              <w:rPr>
+                <w:rFonts w:ascii="Times New Roman" w:hAnsi="Times New Roman" w:cs="Times New Roman"/>
+                <w:sz w:val="24"/>
+                <w:szCs w:val="24"/>
+              </w:rPr>
+            </w:pPr>
+            <w:r>
+              <w:rPr>
+                <w:rFonts w:ascii="Times New Roman" w:hAnsi="Times New Roman" w:cs="Times New Roman"/>
+                <w:sz w:val="24"/>
+                <w:szCs w:val="24"/>
               </w:rPr>
               <w:t>One-Way ANOVA</w:t>
             </w:r>
@@ -3999,11 +5186,17 @@
                 <w:numId w:val="2"/>
               </w:numPr>
               <w:spacing w:before="30" w:after="30"/>
-            </w:pPr>
-            <w:r>
-              <w:rPr>
-                <w:sz w:val="18"/>
-                <w:szCs w:val="18"/>
+              <w:rPr>
+                <w:rFonts w:ascii="Times New Roman" w:hAnsi="Times New Roman" w:cs="Times New Roman"/>
+                <w:sz w:val="24"/>
+                <w:szCs w:val="24"/>
+              </w:rPr>
+            </w:pPr>
+            <w:r>
+              <w:rPr>
+                <w:rFonts w:ascii="Times New Roman" w:hAnsi="Times New Roman" w:cs="Times New Roman"/>
+                <w:sz w:val="24"/>
+                <w:szCs w:val="24"/>
               </w:rPr>
               <w:t>Pearson Correlation</w:t>
             </w:r>
@@ -4016,11 +5209,17 @@
                 <w:numId w:val="2"/>
               </w:numPr>
               <w:spacing w:before="30" w:after="30"/>
-            </w:pPr>
-            <w:r>
-              <w:rPr>
-                <w:sz w:val="18"/>
-                <w:szCs w:val="18"/>
+              <w:rPr>
+                <w:rFonts w:ascii="Times New Roman" w:hAnsi="Times New Roman" w:cs="Times New Roman"/>
+                <w:sz w:val="24"/>
+                <w:szCs w:val="24"/>
+              </w:rPr>
+            </w:pPr>
+            <w:r>
+              <w:rPr>
+                <w:rFonts w:ascii="Times New Roman" w:hAnsi="Times New Roman" w:cs="Times New Roman"/>
+                <w:sz w:val="24"/>
+                <w:szCs w:val="24"/>
               </w:rPr>
               <w:t>Multiple Linear Regression</w:t>
             </w:r>
@@ -4033,11 +5232,17 @@
                 <w:numId w:val="2"/>
               </w:numPr>
               <w:spacing w:before="30" w:after="30"/>
-            </w:pPr>
-            <w:r>
-              <w:rPr>
-                <w:sz w:val="18"/>
-                <w:szCs w:val="18"/>
+              <w:rPr>
+                <w:rFonts w:ascii="Times New Roman" w:hAnsi="Times New Roman" w:cs="Times New Roman"/>
+                <w:sz w:val="24"/>
+                <w:szCs w:val="24"/>
+              </w:rPr>
+            </w:pPr>
+            <w:r>
+              <w:rPr>
+                <w:rFonts w:ascii="Times New Roman" w:hAnsi="Times New Roman" w:cs="Times New Roman"/>
+                <w:sz w:val="24"/>
+                <w:szCs w:val="24"/>
               </w:rPr>
               <w:t>Effect Size (Eta² = 0.4456)</w:t>
             </w:r>
@@ -4050,11 +5255,17 @@
                 <w:numId w:val="2"/>
               </w:numPr>
               <w:spacing w:before="30" w:after="30"/>
-            </w:pPr>
-            <w:r>
-              <w:rPr>
-                <w:sz w:val="18"/>
-                <w:szCs w:val="18"/>
+              <w:rPr>
+                <w:rFonts w:ascii="Times New Roman" w:hAnsi="Times New Roman" w:cs="Times New Roman"/>
+                <w:sz w:val="24"/>
+                <w:szCs w:val="24"/>
+              </w:rPr>
+            </w:pPr>
+            <w:r>
+              <w:rPr>
+                <w:rFonts w:ascii="Times New Roman" w:hAnsi="Times New Roman" w:cs="Times New Roman"/>
+                <w:sz w:val="24"/>
+                <w:szCs w:val="24"/>
               </w:rPr>
               <w:t>p-value Interpretation</w:t>
             </w:r>
@@ -4067,11 +5278,17 @@
                 <w:numId w:val="2"/>
               </w:numPr>
               <w:spacing w:before="30" w:after="30"/>
-            </w:pPr>
-            <w:r>
-              <w:rPr>
-                <w:sz w:val="18"/>
-                <w:szCs w:val="18"/>
+              <w:rPr>
+                <w:rFonts w:ascii="Times New Roman" w:hAnsi="Times New Roman" w:cs="Times New Roman"/>
+                <w:sz w:val="24"/>
+                <w:szCs w:val="24"/>
+              </w:rPr>
+            </w:pPr>
+            <w:r>
+              <w:rPr>
+                <w:rFonts w:ascii="Times New Roman" w:hAnsi="Times New Roman" w:cs="Times New Roman"/>
+                <w:sz w:val="24"/>
+                <w:szCs w:val="24"/>
               </w:rPr>
               <w:t>Distribution Analysis</w:t>
             </w:r>
@@ -4079,7 +5296,7 @@
         </w:tc>
         <w:tc>
           <w:tcPr>
-            <w:tcW w:w="3120" w:type="dxa"/>
+            <w:tcW w:w="3261" w:type="dxa"/>
             <w:tcBorders>
               <w:top w:val="single" w:sz="1" w:space="0" w:color="CCCCCC"/>
               <w:left w:val="single" w:sz="1" w:space="0" w:color="CCCCCC"/>
@@ -4101,11 +5318,17 @@
                 <w:numId w:val="2"/>
               </w:numPr>
               <w:spacing w:before="30" w:after="30"/>
-            </w:pPr>
-            <w:r>
-              <w:rPr>
-                <w:sz w:val="18"/>
-                <w:szCs w:val="18"/>
+              <w:rPr>
+                <w:rFonts w:ascii="Times New Roman" w:hAnsi="Times New Roman" w:cs="Times New Roman"/>
+                <w:sz w:val="24"/>
+                <w:szCs w:val="24"/>
+              </w:rPr>
+            </w:pPr>
+            <w:r>
+              <w:rPr>
+                <w:rFonts w:ascii="Times New Roman" w:hAnsi="Times New Roman" w:cs="Times New Roman"/>
+                <w:sz w:val="24"/>
+                <w:szCs w:val="24"/>
               </w:rPr>
               <w:t>Advanced Excel Formulas</w:t>
             </w:r>
@@ -4118,11 +5341,17 @@
                 <w:numId w:val="2"/>
               </w:numPr>
               <w:spacing w:before="30" w:after="30"/>
-            </w:pPr>
-            <w:r>
-              <w:rPr>
-                <w:sz w:val="18"/>
-                <w:szCs w:val="18"/>
+              <w:rPr>
+                <w:rFonts w:ascii="Times New Roman" w:hAnsi="Times New Roman" w:cs="Times New Roman"/>
+                <w:sz w:val="24"/>
+                <w:szCs w:val="24"/>
+              </w:rPr>
+            </w:pPr>
+            <w:r>
+              <w:rPr>
+                <w:rFonts w:ascii="Times New Roman" w:hAnsi="Times New Roman" w:cs="Times New Roman"/>
+                <w:sz w:val="24"/>
+                <w:szCs w:val="24"/>
               </w:rPr>
               <w:t>PivotTables &amp; PivotCharts</w:t>
             </w:r>
@@ -4135,11 +5364,17 @@
                 <w:numId w:val="2"/>
               </w:numPr>
               <w:spacing w:before="30" w:after="30"/>
-            </w:pPr>
-            <w:r>
-              <w:rPr>
-                <w:sz w:val="18"/>
-                <w:szCs w:val="18"/>
+              <w:rPr>
+                <w:rFonts w:ascii="Times New Roman" w:hAnsi="Times New Roman" w:cs="Times New Roman"/>
+                <w:sz w:val="24"/>
+                <w:szCs w:val="24"/>
+              </w:rPr>
+            </w:pPr>
+            <w:r>
+              <w:rPr>
+                <w:rFonts w:ascii="Times New Roman" w:hAnsi="Times New Roman" w:cs="Times New Roman"/>
+                <w:sz w:val="24"/>
+                <w:szCs w:val="24"/>
               </w:rPr>
               <w:t>Data Analysis ToolPak</w:t>
             </w:r>
@@ -4152,11 +5387,17 @@
                 <w:numId w:val="2"/>
               </w:numPr>
               <w:spacing w:before="30" w:after="30"/>
-            </w:pPr>
-            <w:r>
-              <w:rPr>
-                <w:sz w:val="18"/>
-                <w:szCs w:val="18"/>
+              <w:rPr>
+                <w:rFonts w:ascii="Times New Roman" w:hAnsi="Times New Roman" w:cs="Times New Roman"/>
+                <w:sz w:val="24"/>
+                <w:szCs w:val="24"/>
+              </w:rPr>
+            </w:pPr>
+            <w:r>
+              <w:rPr>
+                <w:rFonts w:ascii="Times New Roman" w:hAnsi="Times New Roman" w:cs="Times New Roman"/>
+                <w:sz w:val="24"/>
+                <w:szCs w:val="24"/>
               </w:rPr>
               <w:t>AVERAGEIF / COUNTIF</w:t>
             </w:r>
@@ -4169,11 +5410,17 @@
                 <w:numId w:val="2"/>
               </w:numPr>
               <w:spacing w:before="30" w:after="30"/>
-            </w:pPr>
-            <w:r>
-              <w:rPr>
-                <w:sz w:val="18"/>
-                <w:szCs w:val="18"/>
+              <w:rPr>
+                <w:rFonts w:ascii="Times New Roman" w:hAnsi="Times New Roman" w:cs="Times New Roman"/>
+                <w:sz w:val="24"/>
+                <w:szCs w:val="24"/>
+              </w:rPr>
+            </w:pPr>
+            <w:r>
+              <w:rPr>
+                <w:rFonts w:ascii="Times New Roman" w:hAnsi="Times New Roman" w:cs="Times New Roman"/>
+                <w:sz w:val="24"/>
+                <w:szCs w:val="24"/>
               </w:rPr>
               <w:t>Conditional Formatting</w:t>
             </w:r>
@@ -4186,11 +5433,17 @@
                 <w:numId w:val="2"/>
               </w:numPr>
               <w:spacing w:before="30" w:after="30"/>
-            </w:pPr>
-            <w:r>
-              <w:rPr>
-                <w:sz w:val="18"/>
-                <w:szCs w:val="18"/>
+              <w:rPr>
+                <w:rFonts w:ascii="Times New Roman" w:hAnsi="Times New Roman" w:cs="Times New Roman"/>
+                <w:sz w:val="24"/>
+                <w:szCs w:val="24"/>
+              </w:rPr>
+            </w:pPr>
+            <w:r>
+              <w:rPr>
+                <w:rFonts w:ascii="Times New Roman" w:hAnsi="Times New Roman" w:cs="Times New Roman"/>
+                <w:sz w:val="24"/>
+                <w:szCs w:val="24"/>
               </w:rPr>
               <w:t>Data Cleaning &amp; Wrangling</w:t>
             </w:r>
@@ -4203,11 +5456,17 @@
                 <w:numId w:val="2"/>
               </w:numPr>
               <w:spacing w:before="30" w:after="30"/>
-            </w:pPr>
-            <w:r>
-              <w:rPr>
-                <w:sz w:val="18"/>
-                <w:szCs w:val="18"/>
+              <w:rPr>
+                <w:rFonts w:ascii="Times New Roman" w:hAnsi="Times New Roman" w:cs="Times New Roman"/>
+                <w:sz w:val="24"/>
+                <w:szCs w:val="24"/>
+              </w:rPr>
+            </w:pPr>
+            <w:r>
+              <w:rPr>
+                <w:rFonts w:ascii="Times New Roman" w:hAnsi="Times New Roman" w:cs="Times New Roman"/>
+                <w:sz w:val="24"/>
+                <w:szCs w:val="24"/>
               </w:rPr>
               <w:t>Histogram &amp; Charts</w:t>
             </w:r>
@@ -4220,11 +5479,17 @@
                 <w:numId w:val="2"/>
               </w:numPr>
               <w:spacing w:before="30" w:after="30"/>
-            </w:pPr>
-            <w:r>
-              <w:rPr>
-                <w:sz w:val="18"/>
-                <w:szCs w:val="18"/>
+              <w:rPr>
+                <w:rFonts w:ascii="Times New Roman" w:hAnsi="Times New Roman" w:cs="Times New Roman"/>
+                <w:sz w:val="24"/>
+                <w:szCs w:val="24"/>
+              </w:rPr>
+            </w:pPr>
+            <w:r>
+              <w:rPr>
+                <w:rFonts w:ascii="Times New Roman" w:hAnsi="Times New Roman" w:cs="Times New Roman"/>
+                <w:sz w:val="24"/>
+                <w:szCs w:val="24"/>
               </w:rPr>
               <w:t>Dashboard Design</w:t>
             </w:r>
@@ -4232,7 +5497,7 @@
         </w:tc>
         <w:tc>
           <w:tcPr>
-            <w:tcW w:w="3120" w:type="dxa"/>
+            <w:tcW w:w="2976" w:type="dxa"/>
             <w:tcBorders>
               <w:top w:val="single" w:sz="1" w:space="0" w:color="CCCCCC"/>
               <w:left w:val="single" w:sz="1" w:space="0" w:color="CCCCCC"/>
@@ -4254,11 +5519,17 @@
                 <w:numId w:val="2"/>
               </w:numPr>
               <w:spacing w:before="30" w:after="30"/>
-            </w:pPr>
-            <w:r>
-              <w:rPr>
-                <w:sz w:val="18"/>
-                <w:szCs w:val="18"/>
+              <w:rPr>
+                <w:rFonts w:ascii="Times New Roman" w:hAnsi="Times New Roman" w:cs="Times New Roman"/>
+                <w:sz w:val="24"/>
+                <w:szCs w:val="24"/>
+              </w:rPr>
+            </w:pPr>
+            <w:r>
+              <w:rPr>
+                <w:rFonts w:ascii="Times New Roman" w:hAnsi="Times New Roman" w:cs="Times New Roman"/>
+                <w:sz w:val="24"/>
+                <w:szCs w:val="24"/>
               </w:rPr>
               <w:t>Survey Data Analysis</w:t>
             </w:r>
@@ -4271,11 +5542,17 @@
                 <w:numId w:val="2"/>
               </w:numPr>
               <w:spacing w:before="30" w:after="30"/>
-            </w:pPr>
-            <w:r>
-              <w:rPr>
-                <w:sz w:val="18"/>
-                <w:szCs w:val="18"/>
+              <w:rPr>
+                <w:rFonts w:ascii="Times New Roman" w:hAnsi="Times New Roman" w:cs="Times New Roman"/>
+                <w:sz w:val="24"/>
+                <w:szCs w:val="24"/>
+              </w:rPr>
+            </w:pPr>
+            <w:r>
+              <w:rPr>
+                <w:rFonts w:ascii="Times New Roman" w:hAnsi="Times New Roman" w:cs="Times New Roman"/>
+                <w:sz w:val="24"/>
+                <w:szCs w:val="24"/>
               </w:rPr>
               <w:t>Outlier Detection</w:t>
             </w:r>
@@ -4288,11 +5565,17 @@
                 <w:numId w:val="2"/>
               </w:numPr>
               <w:spacing w:before="30" w:after="30"/>
-            </w:pPr>
-            <w:r>
-              <w:rPr>
-                <w:sz w:val="18"/>
-                <w:szCs w:val="18"/>
+              <w:rPr>
+                <w:rFonts w:ascii="Times New Roman" w:hAnsi="Times New Roman" w:cs="Times New Roman"/>
+                <w:sz w:val="24"/>
+                <w:szCs w:val="24"/>
+              </w:rPr>
+            </w:pPr>
+            <w:r>
+              <w:rPr>
+                <w:rFonts w:ascii="Times New Roman" w:hAnsi="Times New Roman" w:cs="Times New Roman"/>
+                <w:sz w:val="24"/>
+                <w:szCs w:val="24"/>
               </w:rPr>
               <w:t>Missing Value Treatment</w:t>
             </w:r>
@@ -4305,11 +5588,17 @@
                 <w:numId w:val="2"/>
               </w:numPr>
               <w:spacing w:before="30" w:after="30"/>
-            </w:pPr>
-            <w:r>
-              <w:rPr>
-                <w:sz w:val="18"/>
-                <w:szCs w:val="18"/>
+              <w:rPr>
+                <w:rFonts w:ascii="Times New Roman" w:hAnsi="Times New Roman" w:cs="Times New Roman"/>
+                <w:sz w:val="24"/>
+                <w:szCs w:val="24"/>
+              </w:rPr>
+            </w:pPr>
+            <w:r>
+              <w:rPr>
+                <w:rFonts w:ascii="Times New Roman" w:hAnsi="Times New Roman" w:cs="Times New Roman"/>
+                <w:sz w:val="24"/>
+                <w:szCs w:val="24"/>
               </w:rPr>
               <w:t>Cross-tabulation</w:t>
             </w:r>
@@ -4322,11 +5611,17 @@
                 <w:numId w:val="2"/>
               </w:numPr>
               <w:spacing w:before="30" w:after="30"/>
-            </w:pPr>
-            <w:r>
-              <w:rPr>
-                <w:sz w:val="18"/>
-                <w:szCs w:val="18"/>
+              <w:rPr>
+                <w:rFonts w:ascii="Times New Roman" w:hAnsi="Times New Roman" w:cs="Times New Roman"/>
+                <w:sz w:val="24"/>
+                <w:szCs w:val="24"/>
+              </w:rPr>
+            </w:pPr>
+            <w:r>
+              <w:rPr>
+                <w:rFonts w:ascii="Times New Roman" w:hAnsi="Times New Roman" w:cs="Times New Roman"/>
+                <w:sz w:val="24"/>
+                <w:szCs w:val="24"/>
               </w:rPr>
               <w:t>Residual Analysis</w:t>
             </w:r>
@@ -4339,11 +5634,17 @@
                 <w:numId w:val="2"/>
               </w:numPr>
               <w:spacing w:before="30" w:after="30"/>
-            </w:pPr>
-            <w:r>
-              <w:rPr>
-                <w:sz w:val="18"/>
-                <w:szCs w:val="18"/>
+              <w:rPr>
+                <w:rFonts w:ascii="Times New Roman" w:hAnsi="Times New Roman" w:cs="Times New Roman"/>
+                <w:sz w:val="24"/>
+                <w:szCs w:val="24"/>
+              </w:rPr>
+            </w:pPr>
+            <w:r>
+              <w:rPr>
+                <w:rFonts w:ascii="Times New Roman" w:hAnsi="Times New Roman" w:cs="Times New Roman"/>
+                <w:sz w:val="24"/>
+                <w:szCs w:val="24"/>
               </w:rPr>
               <w:t>Report Writing</w:t>
             </w:r>
@@ -4356,11 +5657,17 @@
                 <w:numId w:val="2"/>
               </w:numPr>
               <w:spacing w:before="30" w:after="30"/>
-            </w:pPr>
-            <w:r>
-              <w:rPr>
-                <w:sz w:val="18"/>
-                <w:szCs w:val="18"/>
+              <w:rPr>
+                <w:rFonts w:ascii="Times New Roman" w:hAnsi="Times New Roman" w:cs="Times New Roman"/>
+                <w:sz w:val="24"/>
+                <w:szCs w:val="24"/>
+              </w:rPr>
+            </w:pPr>
+            <w:r>
+              <w:rPr>
+                <w:rFonts w:ascii="Times New Roman" w:hAnsi="Times New Roman" w:cs="Times New Roman"/>
+                <w:sz w:val="24"/>
+                <w:szCs w:val="24"/>
               </w:rPr>
               <w:t>Data-driven Recommendations</w:t>
             </w:r>
@@ -4373,11 +5680,17 @@
                 <w:numId w:val="2"/>
               </w:numPr>
               <w:spacing w:before="30" w:after="30"/>
-            </w:pPr>
-            <w:r>
-              <w:rPr>
-                <w:sz w:val="18"/>
-                <w:szCs w:val="18"/>
+              <w:rPr>
+                <w:rFonts w:ascii="Times New Roman" w:hAnsi="Times New Roman" w:cs="Times New Roman"/>
+                <w:sz w:val="24"/>
+                <w:szCs w:val="24"/>
+              </w:rPr>
+            </w:pPr>
+            <w:r>
+              <w:rPr>
+                <w:rFonts w:ascii="Times New Roman" w:hAnsi="Times New Roman" w:cs="Times New Roman"/>
+                <w:sz w:val="24"/>
+                <w:szCs w:val="24"/>
               </w:rPr>
               <w:t>Research Methodology</w:t>
             </w:r>
@@ -4388,7 +5701,7 @@
     <w:tbl>
       <w:tblPr>
         <w:tblpPr w:leftFromText="180" w:rightFromText="180" w:vertAnchor="text" w:tblpY="344"/>
-        <w:tblW w:w="9360" w:type="dxa"/>
+        <w:tblW w:w="9839" w:type="dxa"/>
         <w:tblBorders>
           <w:top w:val="single" w:sz="4" w:space="0" w:color="auto"/>
           <w:left w:val="single" w:sz="4" w:space="0" w:color="auto"/>
@@ -4404,12 +5717,12 @@
         <w:tblLook w:val="0000" w:firstRow="0" w:lastRow="0" w:firstColumn="0" w:lastColumn="0" w:noHBand="0" w:noVBand="0"/>
       </w:tblPr>
       <w:tblGrid>
-        <w:gridCol w:w="9360"/>
+        <w:gridCol w:w="9839"/>
       </w:tblGrid>
       <w:tr>
         <w:tc>
           <w:tcPr>
-            <w:tcW w:w="9360" w:type="dxa"/>
+            <w:tcW w:w="9839" w:type="dxa"/>
             <w:tcBorders>
               <w:top w:val="single" w:sz="6" w:space="0" w:color="1F4E79"/>
               <w:left w:val="single" w:sz="6" w:space="0" w:color="1F4E79"/>
@@ -4426,36 +5739,56 @@
           </w:tcPr>
           <w:p>
             <w:pPr>
+              <w:pStyle w:val="ListParagraph"/>
+              <w:numPr>
+                <w:ilvl w:val="0"/>
+                <w:numId w:val="4"/>
+              </w:numPr>
               <w:spacing w:after="60"/>
             </w:pPr>
-            <w:r>
-              <w:rPr>
-                <w:rFonts w:cs="Arial"/>
+            <w:proofErr w:type="spellStart"/>
+            <w:r>
+              <w:rPr>
                 <w:b/>
                 <w:bCs/>
                 <w:color w:val="1F4E79"/>
                 <w:sz w:val="22"/>
                 <w:szCs w:val="22"/>
               </w:rPr>
-              <w:t>🐙  GitHub Portfolio</w:t>
+              <w:t>GitHub</w:t>
+            </w:r>
+            <w:proofErr w:type="spellEnd"/>
+            <w:r>
+              <w:rPr>
+                <w:b/>
+                <w:bCs/>
+                <w:color w:val="1F4E79"/>
+                <w:sz w:val="22"/>
+                <w:szCs w:val="22"/>
+              </w:rPr>
+              <w:t xml:space="preserve"> Portfolio</w:t>
             </w:r>
           </w:p>
           <w:p>
             <w:pPr>
               <w:spacing w:after="60"/>
               <w:rPr>
-                <w:rFonts w:cs="Arial"/>
+                <w:rFonts w:ascii="Times New Roman" w:hAnsi="Times New Roman" w:cs="Times New Roman"/>
                 <w:i/>
                 <w:iCs/>
                 <w:color w:val="2E75B6"/>
-              </w:rPr>
-            </w:pPr>
-            <w:r>
-              <w:rPr>
-                <w:rFonts w:cs="Arial"/>
+                <w:sz w:val="24"/>
+                <w:szCs w:val="24"/>
+              </w:rPr>
+            </w:pPr>
+            <w:r>
+              <w:rPr>
+                <w:rFonts w:ascii="Times New Roman" w:hAnsi="Times New Roman" w:cs="Times New Roman"/>
                 <w:b/>
                 <w:bCs/>
                 <w:color w:val="222222"/>
+                <w:sz w:val="24"/>
+                <w:szCs w:val="24"/>
               </w:rPr>
               <w:t xml:space="preserve">Project Repository: </w:t>
             </w:r>
@@ -4463,9 +5796,11 @@
               <w:r>
                 <w:rPr>
                   <w:rStyle w:val="Hyperlink"/>
-                  <w:rFonts w:cs="Arial"/>
+                  <w:rFonts w:ascii="Times New Roman" w:hAnsi="Times New Roman" w:cs="Times New Roman"/>
                   <w:i/>
                   <w:iCs/>
+                  <w:sz w:val="24"/>
+                  <w:szCs w:val="24"/>
                 </w:rPr>
                 <w:t>https://github.com/aditi-s-jadhav/fuel-consumption-analysis</w:t>
               </w:r>
@@ -4477,94 +5812,54 @@
             </w:pPr>
             <w:r>
               <w:rPr>
-                <w:rFonts w:cs="Arial"/>
+                <w:rFonts w:ascii="Times New Roman" w:hAnsi="Times New Roman" w:cs="Times New Roman"/>
                 <w:color w:val="595959"/>
-                <w:sz w:val="18"/>
-                <w:szCs w:val="18"/>
-              </w:rPr>
-              <w:t>Files to upload: Fuel_Consumption_Analysis_Project</w:t>
-            </w:r>
-            <w:proofErr w:type="gramStart"/>
-            <w:r>
-              <w:rPr>
-                <w:rFonts w:cs="Arial"/>
+                <w:sz w:val="24"/>
+                <w:szCs w:val="24"/>
+              </w:rPr>
+              <w:t>Files to upload: Fu</w:t>
+            </w:r>
+            <w:r>
+              <w:rPr>
+                <w:rFonts w:ascii="Times New Roman" w:hAnsi="Times New Roman" w:cs="Times New Roman"/>
                 <w:color w:val="595959"/>
-                <w:sz w:val="18"/>
-                <w:szCs w:val="18"/>
-              </w:rPr>
-              <w:t>..</w:t>
-            </w:r>
-            <w:proofErr w:type="spellStart"/>
-            <w:proofErr w:type="gramEnd"/>
-            <w:r>
-              <w:rPr>
-                <w:rFonts w:cs="Arial"/>
+                <w:sz w:val="24"/>
+                <w:szCs w:val="24"/>
+              </w:rPr>
+              <w:t>el_Consumption_Analysis_Project</w:t>
+            </w:r>
+            <w:r>
+              <w:rPr>
+                <w:rFonts w:ascii="Times New Roman" w:hAnsi="Times New Roman" w:cs="Times New Roman"/>
                 <w:color w:val="595959"/>
-                <w:sz w:val="18"/>
-                <w:szCs w:val="18"/>
-              </w:rPr>
-              <w:t>xlsx</w:t>
-            </w:r>
-            <w:proofErr w:type="spellEnd"/>
-            <w:r>
-              <w:rPr>
-                <w:rFonts w:cs="Arial"/>
-                <w:color w:val="595959"/>
-                <w:sz w:val="18"/>
-                <w:szCs w:val="18"/>
-              </w:rPr>
-              <w:t xml:space="preserve">  •  Project_Report.pdf  •  Dashboard_Screenshot.png  •  README.md</w:t>
+                <w:sz w:val="24"/>
+                <w:szCs w:val="24"/>
+              </w:rPr>
+              <w:t>.xlsx  •  Project_Report.pdf  •  Dashboard_Screenshot.png  •  README.md</w:t>
             </w:r>
           </w:p>
         </w:tc>
       </w:tr>
     </w:tbl>
-    <w:p>
-      <w:pPr>
-        <w:spacing w:before="160" w:after="160"/>
-      </w:pPr>
-    </w:p>
-    <w:p>
-      <w:pPr>
-        <w:spacing w:before="120" w:after="120"/>
-      </w:pPr>
-    </w:p>
-    <w:p>
-      <w:pPr>
-        <w:spacing w:before="160" w:after="160"/>
-      </w:pPr>
-    </w:p>
-    <w:p/>
-    <w:p/>
     <w:p/>
     <w:p>
       <w:pPr>
         <w:spacing w:before="80"/>
         <w:jc w:val="center"/>
+        <w:rPr>
+          <w:rFonts w:ascii="Times New Roman" w:hAnsi="Times New Roman" w:cs="Times New Roman"/>
+          <w:sz w:val="24"/>
+          <w:szCs w:val="24"/>
+        </w:rPr>
       </w:pPr>
       <w:r>
         <w:rPr>
-          <w:rFonts w:cs="Arial"/>
+          <w:rFonts w:ascii="Times New Roman" w:hAnsi="Times New Roman" w:cs="Times New Roman"/>
           <w:i/>
           <w:iCs/>
           <w:color w:val="888888"/>
-          <w:sz w:val="17"/>
-          <w:szCs w:val="17"/>
-        </w:rPr>
-        <w:t>Fuel Consumption Analysis — Phaltan Survey  |  Aditi Subhash Jadhav  |  20</w:t>
-      </w:r>
-      <w:bookmarkStart w:id="0" w:name="_GoBack"/>
-      <w:bookmarkEnd w:id="0"/>
-      <w:r>
-        <w:rPr>
-          <w:rFonts w:cs="Arial"/>
-          <w:i/>
-          <w:iCs/>
-          <w:color w:val="888888"/>
-          <w:sz w:val="17"/>
-          <w:szCs w:val="17"/>
-        </w:rPr>
-        <w:t>26  |  n=567  |  30 Variables</w:t>
+        </w:rPr>
+        <w:t>Fuel Consumption Analysis — Phaltan Survey  |  Aditi Subhash Jadhav  |  2026  |  n=567  |  30 Variables</w:t>
       </w:r>
     </w:p>
     <w:sectPr>
@@ -4580,6 +5875,119 @@
 <file path=word/numbering.xml><?xml version="1.0" encoding="utf-8"?>
 <w:numbering xmlns:wpc="http://schemas.microsoft.com/office/word/2010/wordprocessingCanvas" xmlns:mc="http://schemas.openxmlformats.org/markup-compatibility/2006" xmlns:o="urn:schemas-microsoft-com:office:office" xmlns:r="http://schemas.openxmlformats.org/officeDocument/2006/relationships" xmlns:m="http://schemas.openxmlformats.org/officeDocument/2006/math" xmlns:v="urn:schemas-microsoft-com:vml" xmlns:wp14="http://schemas.microsoft.com/office/word/2010/wordprocessingDrawing" xmlns:wp="http://schemas.openxmlformats.org/drawingml/2006/wordprocessingDrawing" xmlns:w10="urn:schemas-microsoft-com:office:word" xmlns:w="http://schemas.openxmlformats.org/wordprocessingml/2006/main" xmlns:w14="http://schemas.microsoft.com/office/word/2010/wordml" xmlns:wpg="http://schemas.microsoft.com/office/word/2010/wordprocessingGroup" xmlns:wpi="http://schemas.microsoft.com/office/word/2010/wordprocessingInk" xmlns:wne="http://schemas.microsoft.com/office/word/2006/wordml" xmlns:wps="http://schemas.microsoft.com/office/word/2010/wordprocessingShape" mc:Ignorable="w14 wp14">
   <w:abstractNum w:abstractNumId="0">
+    <w:nsid w:val="05751A4E"/>
+    <w:multiLevelType w:val="hybridMultilevel"/>
+    <w:tmpl w:val="BADAE87A"/>
+    <w:lvl w:ilvl="0" w:tplc="5D4C9F48">
+      <w:start w:val="1"/>
+      <w:numFmt w:val="bullet"/>
+      <w:lvlText w:val=""/>
+      <w:lvlJc w:val="right"/>
+      <w:pPr>
+        <w:ind w:left="720" w:hanging="360"/>
+      </w:pPr>
+      <w:rPr>
+        <w:rFonts w:ascii="Wingdings" w:hAnsi="Wingdings" w:hint="default"/>
+      </w:rPr>
+    </w:lvl>
+    <w:lvl w:ilvl="1" w:tplc="40090003" w:tentative="1">
+      <w:start w:val="1"/>
+      <w:numFmt w:val="bullet"/>
+      <w:lvlText w:val="o"/>
+      <w:lvlJc w:val="left"/>
+      <w:pPr>
+        <w:ind w:left="1440" w:hanging="360"/>
+      </w:pPr>
+      <w:rPr>
+        <w:rFonts w:ascii="Courier New" w:hAnsi="Courier New" w:cs="Courier New" w:hint="default"/>
+      </w:rPr>
+    </w:lvl>
+    <w:lvl w:ilvl="2" w:tplc="40090005" w:tentative="1">
+      <w:start w:val="1"/>
+      <w:numFmt w:val="bullet"/>
+      <w:lvlText w:val=""/>
+      <w:lvlJc w:val="left"/>
+      <w:pPr>
+        <w:ind w:left="2160" w:hanging="360"/>
+      </w:pPr>
+      <w:rPr>
+        <w:rFonts w:ascii="Wingdings" w:hAnsi="Wingdings" w:hint="default"/>
+      </w:rPr>
+    </w:lvl>
+    <w:lvl w:ilvl="3" w:tplc="40090001" w:tentative="1">
+      <w:start w:val="1"/>
+      <w:numFmt w:val="bullet"/>
+      <w:lvlText w:val=""/>
+      <w:lvlJc w:val="left"/>
+      <w:pPr>
+        <w:ind w:left="2880" w:hanging="360"/>
+      </w:pPr>
+      <w:rPr>
+        <w:rFonts w:ascii="Symbol" w:hAnsi="Symbol" w:hint="default"/>
+      </w:rPr>
+    </w:lvl>
+    <w:lvl w:ilvl="4" w:tplc="40090003" w:tentative="1">
+      <w:start w:val="1"/>
+      <w:numFmt w:val="bullet"/>
+      <w:lvlText w:val="o"/>
+      <w:lvlJc w:val="left"/>
+      <w:pPr>
+        <w:ind w:left="3600" w:hanging="360"/>
+      </w:pPr>
+      <w:rPr>
+        <w:rFonts w:ascii="Courier New" w:hAnsi="Courier New" w:cs="Courier New" w:hint="default"/>
+      </w:rPr>
+    </w:lvl>
+    <w:lvl w:ilvl="5" w:tplc="40090005" w:tentative="1">
+      <w:start w:val="1"/>
+      <w:numFmt w:val="bullet"/>
+      <w:lvlText w:val=""/>
+      <w:lvlJc w:val="left"/>
+      <w:pPr>
+        <w:ind w:left="4320" w:hanging="360"/>
+      </w:pPr>
+      <w:rPr>
+        <w:rFonts w:ascii="Wingdings" w:hAnsi="Wingdings" w:hint="default"/>
+      </w:rPr>
+    </w:lvl>
+    <w:lvl w:ilvl="6" w:tplc="40090001" w:tentative="1">
+      <w:start w:val="1"/>
+      <w:numFmt w:val="bullet"/>
+      <w:lvlText w:val=""/>
+      <w:lvlJc w:val="left"/>
+      <w:pPr>
+        <w:ind w:left="5040" w:hanging="360"/>
+      </w:pPr>
+      <w:rPr>
+        <w:rFonts w:ascii="Symbol" w:hAnsi="Symbol" w:hint="default"/>
+      </w:rPr>
+    </w:lvl>
+    <w:lvl w:ilvl="7" w:tplc="40090003" w:tentative="1">
+      <w:start w:val="1"/>
+      <w:numFmt w:val="bullet"/>
+      <w:lvlText w:val="o"/>
+      <w:lvlJc w:val="left"/>
+      <w:pPr>
+        <w:ind w:left="5760" w:hanging="360"/>
+      </w:pPr>
+      <w:rPr>
+        <w:rFonts w:ascii="Courier New" w:hAnsi="Courier New" w:cs="Courier New" w:hint="default"/>
+      </w:rPr>
+    </w:lvl>
+    <w:lvl w:ilvl="8" w:tplc="40090005" w:tentative="1">
+      <w:start w:val="1"/>
+      <w:numFmt w:val="bullet"/>
+      <w:lvlText w:val=""/>
+      <w:lvlJc w:val="left"/>
+      <w:pPr>
+        <w:ind w:left="6480" w:hanging="360"/>
+      </w:pPr>
+      <w:rPr>
+        <w:rFonts w:ascii="Wingdings" w:hAnsi="Wingdings" w:hint="default"/>
+      </w:rPr>
+    </w:lvl>
+  </w:abstractNum>
+  <w:abstractNum w:abstractNumId="1">
     <w:nsid w:val="11017773"/>
     <w:multiLevelType w:val="hybridMultilevel"/>
     <w:tmpl w:val="71FA2350"/>
@@ -4665,7 +6073,120 @@
       </w:pPr>
     </w:lvl>
   </w:abstractNum>
-  <w:abstractNum w:abstractNumId="1">
+  <w:abstractNum w:abstractNumId="2">
+    <w:nsid w:val="32496012"/>
+    <w:multiLevelType w:val="hybridMultilevel"/>
+    <w:tmpl w:val="97EA7BAC"/>
+    <w:lvl w:ilvl="0" w:tplc="4009000B">
+      <w:start w:val="1"/>
+      <w:numFmt w:val="bullet"/>
+      <w:lvlText w:val=""/>
+      <w:lvlJc w:val="left"/>
+      <w:pPr>
+        <w:ind w:left="720" w:hanging="360"/>
+      </w:pPr>
+      <w:rPr>
+        <w:rFonts w:ascii="Wingdings" w:hAnsi="Wingdings" w:hint="default"/>
+      </w:rPr>
+    </w:lvl>
+    <w:lvl w:ilvl="1" w:tplc="40090003" w:tentative="1">
+      <w:start w:val="1"/>
+      <w:numFmt w:val="bullet"/>
+      <w:lvlText w:val="o"/>
+      <w:lvlJc w:val="left"/>
+      <w:pPr>
+        <w:ind w:left="1440" w:hanging="360"/>
+      </w:pPr>
+      <w:rPr>
+        <w:rFonts w:ascii="Courier New" w:hAnsi="Courier New" w:cs="Courier New" w:hint="default"/>
+      </w:rPr>
+    </w:lvl>
+    <w:lvl w:ilvl="2" w:tplc="40090005" w:tentative="1">
+      <w:start w:val="1"/>
+      <w:numFmt w:val="bullet"/>
+      <w:lvlText w:val=""/>
+      <w:lvlJc w:val="left"/>
+      <w:pPr>
+        <w:ind w:left="2160" w:hanging="360"/>
+      </w:pPr>
+      <w:rPr>
+        <w:rFonts w:ascii="Wingdings" w:hAnsi="Wingdings" w:hint="default"/>
+      </w:rPr>
+    </w:lvl>
+    <w:lvl w:ilvl="3" w:tplc="40090001" w:tentative="1">
+      <w:start w:val="1"/>
+      <w:numFmt w:val="bullet"/>
+      <w:lvlText w:val=""/>
+      <w:lvlJc w:val="left"/>
+      <w:pPr>
+        <w:ind w:left="2880" w:hanging="360"/>
+      </w:pPr>
+      <w:rPr>
+        <w:rFonts w:ascii="Symbol" w:hAnsi="Symbol" w:hint="default"/>
+      </w:rPr>
+    </w:lvl>
+    <w:lvl w:ilvl="4" w:tplc="40090003" w:tentative="1">
+      <w:start w:val="1"/>
+      <w:numFmt w:val="bullet"/>
+      <w:lvlText w:val="o"/>
+      <w:lvlJc w:val="left"/>
+      <w:pPr>
+        <w:ind w:left="3600" w:hanging="360"/>
+      </w:pPr>
+      <w:rPr>
+        <w:rFonts w:ascii="Courier New" w:hAnsi="Courier New" w:cs="Courier New" w:hint="default"/>
+      </w:rPr>
+    </w:lvl>
+    <w:lvl w:ilvl="5" w:tplc="40090005" w:tentative="1">
+      <w:start w:val="1"/>
+      <w:numFmt w:val="bullet"/>
+      <w:lvlText w:val=""/>
+      <w:lvlJc w:val="left"/>
+      <w:pPr>
+        <w:ind w:left="4320" w:hanging="360"/>
+      </w:pPr>
+      <w:rPr>
+        <w:rFonts w:ascii="Wingdings" w:hAnsi="Wingdings" w:hint="default"/>
+      </w:rPr>
+    </w:lvl>
+    <w:lvl w:ilvl="6" w:tplc="40090001" w:tentative="1">
+      <w:start w:val="1"/>
+      <w:numFmt w:val="bullet"/>
+      <w:lvlText w:val=""/>
+      <w:lvlJc w:val="left"/>
+      <w:pPr>
+        <w:ind w:left="5040" w:hanging="360"/>
+      </w:pPr>
+      <w:rPr>
+        <w:rFonts w:ascii="Symbol" w:hAnsi="Symbol" w:hint="default"/>
+      </w:rPr>
+    </w:lvl>
+    <w:lvl w:ilvl="7" w:tplc="40090003" w:tentative="1">
+      <w:start w:val="1"/>
+      <w:numFmt w:val="bullet"/>
+      <w:lvlText w:val="o"/>
+      <w:lvlJc w:val="left"/>
+      <w:pPr>
+        <w:ind w:left="5760" w:hanging="360"/>
+      </w:pPr>
+      <w:rPr>
+        <w:rFonts w:ascii="Courier New" w:hAnsi="Courier New" w:cs="Courier New" w:hint="default"/>
+      </w:rPr>
+    </w:lvl>
+    <w:lvl w:ilvl="8" w:tplc="40090005" w:tentative="1">
+      <w:start w:val="1"/>
+      <w:numFmt w:val="bullet"/>
+      <w:lvlText w:val=""/>
+      <w:lvlJc w:val="left"/>
+      <w:pPr>
+        <w:ind w:left="6480" w:hanging="360"/>
+      </w:pPr>
+      <w:rPr>
+        <w:rFonts w:ascii="Wingdings" w:hAnsi="Wingdings" w:hint="default"/>
+      </w:rPr>
+    </w:lvl>
+  </w:abstractNum>
+  <w:abstractNum w:abstractNumId="3">
     <w:nsid w:val="5F627EB9"/>
     <w:multiLevelType w:val="hybridMultilevel"/>
     <w:tmpl w:val="B0C4C7A0"/>
@@ -4720,16 +6241,22 @@
     </w:lvl>
   </w:abstractNum>
   <w:num w:numId="1">
-    <w:abstractNumId w:val="0"/>
+    <w:abstractNumId w:val="1"/>
     <w:lvlOverride w:ilvl="0">
       <w:startOverride w:val="1"/>
     </w:lvlOverride>
   </w:num>
   <w:num w:numId="2">
-    <w:abstractNumId w:val="1"/>
+    <w:abstractNumId w:val="3"/>
     <w:lvlOverride w:ilvl="0">
       <w:startOverride w:val="1"/>
     </w:lvlOverride>
+  </w:num>
+  <w:num w:numId="3">
+    <w:abstractNumId w:val="2"/>
+  </w:num>
+  <w:num w:numId="4">
+    <w:abstractNumId w:val="0"/>
   </w:num>
 </w:numbering>
 </file>
@@ -5700,7 +7227,7 @@
 </file>
 
 <file path=customXml/itemProps1.xml><?xml version="1.0" encoding="utf-8"?>
-<ds:datastoreItem xmlns:ds="http://schemas.openxmlformats.org/officeDocument/2006/customXml" ds:itemID="{18923960-BB76-489E-948D-C39F64F34A42}">
+<ds:datastoreItem xmlns:ds="http://schemas.openxmlformats.org/officeDocument/2006/customXml" ds:itemID="{54C94075-99A2-47DC-80B7-8408CEEF22D3}">
   <ds:schemaRefs>
     <ds:schemaRef ds:uri="http://schemas.openxmlformats.org/officeDocument/2006/bibliography"/>
   </ds:schemaRefs>

</xml_diff>